<commit_message>
clarifying things in the report
</commit_message>
<xml_diff>
--- a/report/4457_FormalModelExperimentPlan_Myerson.docx
+++ b/report/4457_FormalModelExperimentPlan_Myerson.docx
@@ -4,14 +4,17 @@
   <w:body>
     <w:p>
       <w:pPr>
-        <w:spacing w:after="40"/>
+        <w:pStyle w:val="Heading1"/>
         <w:jc w:val="center"/>
+        <w:rPr>
+          <w:sz w:val="44"/>
+          <w:szCs w:val="44"/>
+        </w:rPr>
       </w:pPr>
       <w:r>
         <w:rPr>
-          <w:rFonts w:eastAsia="Calibri"/>
-          <w:b/>
           <w:sz w:val="44"/>
+          <w:szCs w:val="44"/>
         </w:rPr>
         <w:t>Formal Model and Experiment Plan</w:t>
       </w:r>
@@ -53,10 +56,16 @@
     <w:p>
       <w:pPr>
         <w:spacing w:after="160"/>
+        <w:rPr>
+          <w:sz w:val="24"/>
+          <w:szCs w:val="24"/>
+        </w:rPr>
       </w:pPr>
       <w:r>
         <w:rPr>
           <w:rFonts w:eastAsia="Calibri"/>
+          <w:sz w:val="24"/>
+          <w:szCs w:val="24"/>
         </w:rPr>
         <w:t>If gym users are given live information about how crowded the gym is, does this reduce crowding overall, or can it cause people to shift toward the same times and create new periods of congestion?</w:t>
       </w:r>
@@ -64,10 +73,16 @@
     <w:p>
       <w:pPr>
         <w:spacing w:after="160"/>
+        <w:rPr>
+          <w:sz w:val="24"/>
+          <w:szCs w:val="24"/>
+        </w:rPr>
       </w:pPr>
       <w:r>
         <w:rPr>
           <w:rFonts w:eastAsia="Calibri"/>
+          <w:sz w:val="24"/>
+          <w:szCs w:val="24"/>
         </w:rPr>
         <w:t>We will compare three information conditions (none, live, delayed) and how many past days agents remember (1, 5, or 10). We then measure how crowded the busiest slot gets and how often the gym goes over capacity.</w:t>
       </w:r>
@@ -83,48 +98,48 @@
     <w:p>
       <w:pPr>
         <w:spacing w:after="160"/>
+        <w:rPr>
+          <w:sz w:val="24"/>
+          <w:szCs w:val="24"/>
+        </w:rPr>
       </w:pPr>
       <w:r>
         <w:rPr>
           <w:rFonts w:eastAsia="Calibri"/>
+          <w:sz w:val="24"/>
+          <w:szCs w:val="24"/>
         </w:rPr>
-        <w:t xml:space="preserve">The </w:t>
-      </w:r>
-      <w:proofErr w:type="spellStart"/>
-      <w:r>
-        <w:rPr>
-          <w:rFonts w:eastAsia="Calibri"/>
-        </w:rPr>
-        <w:t>NetLogo</w:t>
-      </w:r>
-      <w:proofErr w:type="spellEnd"/>
-      <w:r>
-        <w:rPr>
-          <w:rFonts w:eastAsia="Calibri"/>
-        </w:rPr>
-        <w:t xml:space="preserve"> El Farol model is not trained on any data. </w:t>
+        <w:t xml:space="preserve">The NetLogo El Farol model is not trained on any data. </w:t>
       </w:r>
       <w:r>
         <w:rPr>
           <w:rFonts w:eastAsia="Calibri"/>
+          <w:sz w:val="24"/>
+          <w:szCs w:val="24"/>
         </w:rPr>
         <w:t xml:space="preserve">The model was created based </w:t>
       </w:r>
       <w:r>
         <w:rPr>
           <w:rFonts w:eastAsia="Calibri"/>
+          <w:sz w:val="24"/>
+          <w:szCs w:val="24"/>
         </w:rPr>
         <w:t>on</w:t>
       </w:r>
       <w:r>
         <w:rPr>
           <w:rFonts w:eastAsia="Calibri"/>
+          <w:sz w:val="24"/>
+          <w:szCs w:val="24"/>
         </w:rPr>
         <w:t xml:space="preserve"> </w:t>
       </w:r>
       <w:r>
         <w:rPr>
           <w:rFonts w:eastAsia="Calibri"/>
+          <w:sz w:val="24"/>
+          <w:szCs w:val="24"/>
         </w:rPr>
         <w:t>Arthur’s paper (1994) and the Rand and Wilensky model (1997/2007). Attendance history starts as random numbers, and each agent’s strategies are random weight vectors.</w:t>
       </w:r>
@@ -132,78 +147,84 @@
     <w:p>
       <w:pPr>
         <w:spacing w:after="160"/>
-      </w:pPr>
-      <w:proofErr w:type="gramStart"/>
+        <w:rPr>
+          <w:sz w:val="24"/>
+          <w:szCs w:val="24"/>
+        </w:rPr>
+      </w:pPr>
       <w:r>
         <w:rPr>
           <w:rFonts w:eastAsia="Calibri"/>
+          <w:sz w:val="24"/>
+          <w:szCs w:val="24"/>
         </w:rPr>
-        <w:t>So</w:t>
+        <w:t>So by using a decade old model along with modern data analytics:</w:t>
       </w:r>
-      <w:proofErr w:type="gramEnd"/>
+    </w:p>
+    <w:p>
+      <w:pPr>
+        <w:pStyle w:val="ListParagraph"/>
+        <w:numPr>
+          <w:ilvl w:val="0"/>
+          <w:numId w:val="11"/>
+        </w:numPr>
+        <w:spacing w:after="80"/>
+        <w:rPr>
+          <w:sz w:val="24"/>
+          <w:szCs w:val="24"/>
+        </w:rPr>
+      </w:pPr>
       <w:r>
         <w:rPr>
           <w:rFonts w:eastAsia="Calibri"/>
+          <w:sz w:val="24"/>
+          <w:szCs w:val="24"/>
         </w:rPr>
-        <w:t xml:space="preserve"> by using a decade old model along with modern data analytics:</w:t>
+        <w:t>Calibrate parameters from real WSRC counts: how many agents, what counts as capacity, which evening slots, and the typical demand curve.</w:t>
       </w:r>
     </w:p>
     <w:p>
       <w:pPr>
+        <w:pStyle w:val="ListParagraph"/>
+        <w:numPr>
+          <w:ilvl w:val="0"/>
+          <w:numId w:val="11"/>
+        </w:numPr>
         <w:spacing w:after="80"/>
+        <w:rPr>
+          <w:sz w:val="24"/>
+          <w:szCs w:val="24"/>
+        </w:rPr>
       </w:pPr>
       <w:r>
         <w:rPr>
           <w:rFonts w:eastAsia="Calibri"/>
+          <w:sz w:val="24"/>
+          <w:szCs w:val="24"/>
         </w:rPr>
-        <w:t>1. Calibrate parameters from real WSRC counts: how many agents, what counts as capacity, which evening slots, and the typical demand curve.</w:t>
+        <w:t>Validate the simulation: does the evening shape, the share of half-hours over capacity, and the variance look like the real gym?</w:t>
       </w:r>
     </w:p>
     <w:p>
       <w:pPr>
-        <w:spacing w:after="80"/>
+        <w:pStyle w:val="ListParagraph"/>
+        <w:numPr>
+          <w:ilvl w:val="0"/>
+          <w:numId w:val="11"/>
+        </w:numPr>
+        <w:spacing w:after="160"/>
+        <w:rPr>
+          <w:sz w:val="24"/>
+          <w:szCs w:val="24"/>
+        </w:rPr>
       </w:pPr>
       <w:r>
         <w:rPr>
           <w:rFonts w:eastAsia="Calibri"/>
+          <w:sz w:val="24"/>
+          <w:szCs w:val="24"/>
         </w:rPr>
-        <w:t>2. Validate the simulation: does the evening shape, the share of half-hours over capacity, and the variance look like the real gym?</w:t>
-      </w:r>
-    </w:p>
-    <w:p>
-      <w:pPr>
-        <w:spacing w:after="160"/>
-      </w:pPr>
-      <w:r>
-        <w:rPr>
-          <w:rFonts w:eastAsia="Calibri"/>
-        </w:rPr>
-        <w:t>3. Seed each agent’s starting memory with real past occupancy instead of random numbers.</w:t>
-      </w:r>
-    </w:p>
-    <w:p>
-      <w:pPr>
-        <w:spacing w:after="160"/>
-      </w:pPr>
-      <w:r>
-        <w:rPr>
-          <w:rFonts w:eastAsia="Calibri"/>
-        </w:rPr>
-        <w:t xml:space="preserve">The earlier task list </w:t>
-      </w:r>
-      <w:proofErr w:type="gramStart"/>
-      <w:r>
-        <w:rPr>
-          <w:rFonts w:eastAsia="Calibri"/>
-        </w:rPr>
-        <w:t>said</w:t>
-      </w:r>
-      <w:proofErr w:type="gramEnd"/>
-      <w:r>
-        <w:rPr>
-          <w:rFonts w:eastAsia="Calibri"/>
-        </w:rPr>
-        <w:t xml:space="preserve"> “Train the model with all the data.” That row is now “Calibrate and validate the model with the data.”</w:t>
+        <w:t>Seed each agent’s starting memory with real past occupancy instead of random numbers.</w:t>
       </w:r>
     </w:p>
     <w:p>
@@ -219,213 +240,127 @@
     </w:p>
     <w:p>
       <w:pPr>
+        <w:pStyle w:val="ListParagraph"/>
+        <w:numPr>
+          <w:ilvl w:val="0"/>
+          <w:numId w:val="15"/>
+        </w:numPr>
         <w:spacing w:after="160"/>
-      </w:pPr>
-      <w:proofErr w:type="gramStart"/>
+        <w:rPr>
+          <w:sz w:val="24"/>
+          <w:szCs w:val="24"/>
+        </w:rPr>
+      </w:pPr>
       <w:r>
         <w:rPr>
           <w:rFonts w:eastAsia="Calibri"/>
+          <w:b/>
+          <w:bCs/>
+          <w:sz w:val="24"/>
+          <w:szCs w:val="24"/>
+          <w:u w:val="single"/>
         </w:rPr>
-        <w:t>@WesternWeightRm</w:t>
-      </w:r>
-      <w:proofErr w:type="gramEnd"/>
-      <w:r>
-        <w:rPr>
-          <w:rFonts w:eastAsia="Calibri"/>
-        </w:rPr>
-        <w:t xml:space="preserve"> (X). Staff post counts about every 30 minutes. We pulled the timeline from 1 September 2025 to 27 October 2026 (1,174 posts). 321 posts had </w:t>
-      </w:r>
-      <w:proofErr w:type="gramStart"/>
-      <w:r>
-        <w:rPr>
-          <w:rFonts w:eastAsia="Calibri"/>
-        </w:rPr>
-        <w:t>the numbers</w:t>
-      </w:r>
-      <w:proofErr w:type="gramEnd"/>
-      <w:r>
-        <w:rPr>
-          <w:rFonts w:eastAsia="Calibri"/>
-        </w:rPr>
-        <w:t xml:space="preserve"> in the text. 850 were images, so we ran Tesseract OCR. Only 3 posts (0.26%) could not be parsed. A 30-post OCR spot-check matched the cards</w:t>
+        <w:t>@WesternWeightRm (X)</w:t>
       </w:r>
       <w:r>
         <w:rPr>
           <w:rFonts w:eastAsia="Calibri"/>
+          <w:sz w:val="24"/>
+          <w:szCs w:val="24"/>
+        </w:rPr>
+        <w:t xml:space="preserve"> Staff post counts about every 30 minutes. We pulled the timeline from 1 September 2025 to 27 October 2026 (1,174 posts). 321 posts had the numbers in the text. 850 were images, so we ran Tesseract OCR. Only 3 posts (0.26%) could not be parsed. A 30-post OCR spot-check matched the cards</w:t>
+      </w:r>
+      <w:r>
+        <w:rPr>
+          <w:rFonts w:eastAsia="Calibri"/>
+          <w:sz w:val="24"/>
+          <w:szCs w:val="24"/>
         </w:rPr>
         <w:t>.</w:t>
       </w:r>
     </w:p>
     <w:p>
       <w:pPr>
+        <w:pStyle w:val="ListParagraph"/>
+        <w:numPr>
+          <w:ilvl w:val="0"/>
+          <w:numId w:val="15"/>
+        </w:numPr>
         <w:spacing w:after="160"/>
+        <w:rPr>
+          <w:sz w:val="24"/>
+          <w:szCs w:val="24"/>
+        </w:rPr>
       </w:pPr>
       <w:r>
         <w:rPr>
           <w:rFonts w:eastAsia="Calibri"/>
+          <w:b/>
+          <w:bCs/>
+          <w:sz w:val="24"/>
+          <w:szCs w:val="24"/>
+          <w:u w:val="single"/>
         </w:rPr>
-        <w:t>westernusc.ca/</w:t>
+        <w:t>westernusc.ca/wsrc-status</w:t>
       </w:r>
-      <w:proofErr w:type="spellStart"/>
       <w:r>
         <w:rPr>
           <w:rFonts w:eastAsia="Calibri"/>
+          <w:sz w:val="24"/>
+          <w:szCs w:val="24"/>
         </w:rPr>
-        <w:t>wsrc</w:t>
+        <w:t>. The same numbers on a live page. We started polling it so we still have data if X scraping fails later.</w:t>
       </w:r>
-      <w:proofErr w:type="spellEnd"/>
+    </w:p>
+    <w:p>
+      <w:pPr>
+        <w:pStyle w:val="ListParagraph"/>
+        <w:numPr>
+          <w:ilvl w:val="0"/>
+          <w:numId w:val="15"/>
+        </w:numPr>
+        <w:spacing w:after="160"/>
+        <w:rPr>
+          <w:sz w:val="24"/>
+          <w:szCs w:val="24"/>
+        </w:rPr>
+      </w:pPr>
       <w:r>
         <w:rPr>
           <w:rFonts w:eastAsia="Calibri"/>
+          <w:b/>
+          <w:bCs/>
+          <w:sz w:val="24"/>
+          <w:szCs w:val="24"/>
+          <w:u w:val="single"/>
         </w:rPr>
-        <w:t xml:space="preserve">-status. The same numbers on a live page. We started polling </w:t>
+        <w:t>Gazette (2022)</w:t>
       </w:r>
-      <w:proofErr w:type="gramStart"/>
       <w:r>
         <w:rPr>
           <w:rFonts w:eastAsia="Calibri"/>
+          <w:sz w:val="24"/>
+          <w:szCs w:val="24"/>
         </w:rPr>
-        <w:t>it</w:t>
+        <w:t>. Used only as a sanity check on which days and hours are busy. Not used to set parameters.</w:t>
       </w:r>
-      <w:proofErr w:type="gramEnd"/>
+    </w:p>
+    <w:p>
+      <w:pPr>
+        <w:spacing w:after="160"/>
+        <w:rPr>
+          <w:sz w:val="24"/>
+          <w:szCs w:val="24"/>
+        </w:rPr>
+      </w:pPr>
       <w:r>
         <w:rPr>
           <w:rFonts w:eastAsia="Calibri"/>
-        </w:rPr>
-        <w:t xml:space="preserve"> so we still have data if X scraping fails later.</w:t>
-      </w:r>
-    </w:p>
-    <w:p>
-      <w:pPr>
-        <w:spacing w:after="160"/>
-      </w:pPr>
-      <w:r>
-        <w:rPr>
-          <w:rFonts w:eastAsia="Calibri"/>
-        </w:rPr>
-        <w:t>Gazette (2022). Used only as a sanity check on which days and hours are busy. Not used to set parameters.</w:t>
-      </w:r>
-    </w:p>
-    <w:p>
-      <w:pPr>
-        <w:spacing w:after="160"/>
-      </w:pPr>
-      <w:r>
-        <w:rPr>
-          <w:rFonts w:eastAsia="Calibri"/>
+          <w:sz w:val="24"/>
+          <w:szCs w:val="24"/>
         </w:rPr>
         <w:lastRenderedPageBreak/>
-        <w:t xml:space="preserve">Fitness </w:t>
-      </w:r>
-      <w:proofErr w:type="spellStart"/>
-      <w:r>
-        <w:rPr>
-          <w:rFonts w:eastAsia="Calibri"/>
-        </w:rPr>
-        <w:t>centre</w:t>
-      </w:r>
-      <w:proofErr w:type="spellEnd"/>
-      <w:r>
-        <w:rPr>
-          <w:rFonts w:eastAsia="Calibri"/>
-        </w:rPr>
-        <w:t xml:space="preserve"> = 1st + 4th Fl. (the two weight rooms). Cardio mezz (CM) is stored but left out of capacity, demand, and validation.</w:t>
-      </w:r>
-    </w:p>
-    <w:p>
-      <w:pPr>
-        <w:pStyle w:val="Heading2"/>
-      </w:pPr>
-      <w:r>
-        <w:t>What we dropped</w:t>
-      </w:r>
-    </w:p>
-    <w:p>
-      <w:pPr>
-        <w:spacing w:after="80"/>
-      </w:pPr>
-      <w:proofErr w:type="gramStart"/>
-      <w:r>
-        <w:rPr>
-          <w:rFonts w:eastAsia="Calibri"/>
-        </w:rPr>
-        <w:t>@WesternGymBot</w:t>
-      </w:r>
-      <w:proofErr w:type="gramEnd"/>
-      <w:r>
-        <w:rPr>
-          <w:rFonts w:eastAsia="Calibri"/>
-        </w:rPr>
-        <w:t xml:space="preserve">. These are prediction-vs-observed charts. </w:t>
-      </w:r>
-      <w:proofErr w:type="spellStart"/>
-      <w:r>
-        <w:rPr>
-          <w:rFonts w:eastAsia="Calibri"/>
-        </w:rPr>
-        <w:t>Digitising</w:t>
-      </w:r>
-      <w:proofErr w:type="spellEnd"/>
-      <w:r>
-        <w:rPr>
-          <w:rFonts w:eastAsia="Calibri"/>
-        </w:rPr>
-        <w:t xml:space="preserve"> charts is extra work, and the observed series is already </w:t>
-      </w:r>
-      <w:proofErr w:type="gramStart"/>
-      <w:r>
-        <w:rPr>
-          <w:rFonts w:eastAsia="Calibri"/>
-        </w:rPr>
-        <w:t>in @</w:t>
-      </w:r>
-      <w:proofErr w:type="gramEnd"/>
-      <w:r>
-        <w:rPr>
-          <w:rFonts w:eastAsia="Calibri"/>
-        </w:rPr>
-        <w:t>WesternWeightRm.</w:t>
-      </w:r>
-    </w:p>
-    <w:p>
-      <w:pPr>
-        <w:spacing w:after="80"/>
-      </w:pPr>
-      <w:r>
-        <w:rPr>
-          <w:rFonts w:eastAsia="Calibri"/>
-        </w:rPr>
-        <w:t>Mendeley fitness-gym dataset. Six days of pressure and humidity sensors, not attendance.</w:t>
-      </w:r>
-    </w:p>
-    <w:p>
-      <w:pPr>
-        <w:spacing w:after="80"/>
-      </w:pPr>
-      <w:proofErr w:type="spellStart"/>
-      <w:r>
-        <w:rPr>
-          <w:rFonts w:eastAsia="Calibri"/>
-        </w:rPr>
-        <w:t>metaodi</w:t>
-      </w:r>
-      <w:proofErr w:type="spellEnd"/>
-      <w:r>
-        <w:rPr>
-          <w:rFonts w:eastAsia="Calibri"/>
-        </w:rPr>
-        <w:t>/gym-occupancy. Swiss gyms, different setting.</w:t>
-      </w:r>
-    </w:p>
-    <w:p>
-      <w:pPr>
-        <w:spacing w:after="160"/>
-      </w:pPr>
-      <w:r>
-        <w:rPr>
-          <w:rFonts w:eastAsia="Calibri"/>
-        </w:rPr>
-        <w:t>Kaggle UC Berkeley gym (2015–17). We may mention it in one comparison paragraph later. It is not used to set our parameters.</w:t>
+        <w:t>Fitness centre = 1st + 4th Fl. (the two weight rooms).</w:t>
       </w:r>
     </w:p>
     <w:p>
@@ -439,34 +374,48 @@
     <w:p>
       <w:pPr>
         <w:spacing w:after="160"/>
+        <w:rPr>
+          <w:sz w:val="24"/>
+          <w:szCs w:val="24"/>
+        </w:rPr>
       </w:pPr>
       <w:r>
         <w:rPr>
           <w:rFonts w:eastAsia="Calibri"/>
+          <w:sz w:val="24"/>
+          <w:szCs w:val="24"/>
         </w:rPr>
         <w:t>We model</w:t>
       </w:r>
       <w:r>
         <w:rPr>
           <w:rFonts w:eastAsia="Calibri"/>
+          <w:sz w:val="24"/>
+          <w:szCs w:val="24"/>
         </w:rPr>
         <w:t>ed</w:t>
       </w:r>
       <w:r>
         <w:rPr>
           <w:rFonts w:eastAsia="Calibri"/>
+          <w:sz w:val="24"/>
+          <w:szCs w:val="24"/>
         </w:rPr>
         <w:t xml:space="preserve"> weekday evenings, 4:00 PM–10:00 PM, in 12 half-hour slots. That window is fully open Monday–Thursday (Friday closes at </w:t>
       </w:r>
       <w:r>
         <w:rPr>
           <w:rFonts w:eastAsia="Calibri"/>
+          <w:sz w:val="24"/>
+          <w:szCs w:val="24"/>
         </w:rPr>
         <w:t>8:00 PM</w:t>
       </w:r>
       <w:r>
         <w:rPr>
           <w:rFonts w:eastAsia="Calibri"/>
+          <w:sz w:val="24"/>
+          <w:szCs w:val="24"/>
         </w:rPr>
         <w:t>). Weekends, holidays, reading week, exams, and summer are excluded.</w:t>
       </w:r>
@@ -474,40 +423,50 @@
     <w:p>
       <w:pPr>
         <w:spacing w:after="160"/>
+        <w:rPr>
+          <w:sz w:val="24"/>
+          <w:szCs w:val="24"/>
+        </w:rPr>
       </w:pPr>
       <w:r>
         <w:rPr>
           <w:rFonts w:eastAsia="Calibri"/>
+          <w:sz w:val="24"/>
+          <w:szCs w:val="24"/>
         </w:rPr>
         <w:t xml:space="preserve">On that window we have 81 evenings and 324 half-hour observations (4 September 2025 – 27 October 2026). Coverage is uneven: staff post more reliably </w:t>
       </w:r>
-      <w:proofErr w:type="gramStart"/>
       <w:r>
         <w:rPr>
           <w:rFonts w:eastAsia="Calibri"/>
+          <w:sz w:val="24"/>
+          <w:szCs w:val="24"/>
         </w:rPr>
-        <w:t>on</w:t>
+        <w:t xml:space="preserve">every 1 </w:t>
       </w:r>
-      <w:proofErr w:type="gramEnd"/>
       <w:r>
         <w:rPr>
           <w:rFonts w:eastAsia="Calibri"/>
+          <w:sz w:val="24"/>
+          <w:szCs w:val="24"/>
         </w:rPr>
-        <w:t xml:space="preserve"> the hour than </w:t>
+        <w:t xml:space="preserve">hour than </w:t>
       </w:r>
-      <w:proofErr w:type="gramStart"/>
       <w:r>
         <w:rPr>
           <w:rFonts w:eastAsia="Calibri"/>
+          <w:sz w:val="24"/>
+          <w:szCs w:val="24"/>
         </w:rPr>
-        <w:t>on</w:t>
+        <w:t>every</w:t>
       </w:r>
-      <w:proofErr w:type="gramEnd"/>
       <w:r>
         <w:rPr>
           <w:rFonts w:eastAsia="Calibri"/>
+          <w:sz w:val="24"/>
+          <w:szCs w:val="24"/>
         </w:rPr>
-        <w:t xml:space="preserve"> the half-hour.</w:t>
+        <w:t xml:space="preserve"> half-hour.</w:t>
       </w:r>
     </w:p>
     <w:tbl>
@@ -532,10 +491,15 @@
           <w:p>
             <w:pPr>
               <w:spacing w:before="60" w:after="60"/>
+              <w:rPr>
+                <w:sz w:val="24"/>
+                <w:szCs w:val="24"/>
+              </w:rPr>
             </w:pPr>
             <w:r>
               <w:rPr>
-                <w:sz w:val="20"/>
+                <w:sz w:val="24"/>
+                <w:szCs w:val="24"/>
               </w:rPr>
               <w:t>Quantity</w:t>
             </w:r>
@@ -549,10 +513,15 @@
             <w:pPr>
               <w:spacing w:before="60" w:after="60"/>
               <w:cnfStyle w:val="100000000000" w:firstRow="1" w:lastRow="0" w:firstColumn="0" w:lastColumn="0" w:oddVBand="0" w:evenVBand="0" w:oddHBand="0" w:evenHBand="0" w:firstRowFirstColumn="0" w:firstRowLastColumn="0" w:lastRowFirstColumn="0" w:lastRowLastColumn="0"/>
+              <w:rPr>
+                <w:sz w:val="24"/>
+                <w:szCs w:val="24"/>
+              </w:rPr>
             </w:pPr>
             <w:r>
               <w:rPr>
-                <w:sz w:val="20"/>
+                <w:sz w:val="24"/>
+                <w:szCs w:val="24"/>
               </w:rPr>
               <w:t>Value</w:t>
             </w:r>
@@ -571,10 +540,15 @@
           <w:p>
             <w:pPr>
               <w:spacing w:before="40" w:after="40"/>
+              <w:rPr>
+                <w:sz w:val="24"/>
+                <w:szCs w:val="24"/>
+              </w:rPr>
             </w:pPr>
             <w:r>
               <w:rPr>
-                <w:sz w:val="20"/>
+                <w:sz w:val="24"/>
+                <w:szCs w:val="24"/>
               </w:rPr>
               <w:t>Evenings / half-hour slots</w:t>
             </w:r>
@@ -588,10 +562,15 @@
             <w:pPr>
               <w:spacing w:before="40" w:after="40"/>
               <w:cnfStyle w:val="000000100000" w:firstRow="0" w:lastRow="0" w:firstColumn="0" w:lastColumn="0" w:oddVBand="0" w:evenVBand="0" w:oddHBand="1" w:evenHBand="0" w:firstRowFirstColumn="0" w:firstRowLastColumn="0" w:lastRowFirstColumn="0" w:lastRowLastColumn="0"/>
+              <w:rPr>
+                <w:sz w:val="24"/>
+                <w:szCs w:val="24"/>
+              </w:rPr>
             </w:pPr>
             <w:r>
               <w:rPr>
-                <w:sz w:val="20"/>
+                <w:sz w:val="24"/>
+                <w:szCs w:val="24"/>
               </w:rPr>
               <w:t>81 / 324</w:t>
             </w:r>
@@ -607,54 +586,66 @@
           <w:p>
             <w:pPr>
               <w:spacing w:before="40" w:after="40"/>
+              <w:rPr>
+                <w:sz w:val="24"/>
+                <w:szCs w:val="24"/>
+              </w:rPr>
             </w:pPr>
             <w:r>
               <w:rPr>
-                <w:sz w:val="20"/>
+                <w:sz w:val="24"/>
+                <w:szCs w:val="24"/>
               </w:rPr>
               <w:t>Mean occupancy (</w:t>
             </w:r>
             <w:r>
               <w:rPr>
-                <w:sz w:val="20"/>
+                <w:sz w:val="24"/>
+                <w:szCs w:val="24"/>
               </w:rPr>
               <w:t>1</w:t>
             </w:r>
             <w:r>
               <w:rPr>
-                <w:sz w:val="20"/>
+                <w:sz w:val="24"/>
+                <w:szCs w:val="24"/>
                 <w:vertAlign w:val="superscript"/>
               </w:rPr>
               <w:t>st</w:t>
             </w:r>
             <w:r>
               <w:rPr>
-                <w:sz w:val="20"/>
+                <w:sz w:val="24"/>
+                <w:szCs w:val="24"/>
               </w:rPr>
               <w:t xml:space="preserve"> + </w:t>
             </w:r>
             <w:r>
               <w:rPr>
-                <w:sz w:val="20"/>
+                <w:sz w:val="24"/>
+                <w:szCs w:val="24"/>
               </w:rPr>
               <w:t>4</w:t>
             </w:r>
             <w:r>
               <w:rPr>
-                <w:sz w:val="20"/>
+                <w:sz w:val="24"/>
+                <w:szCs w:val="24"/>
                 <w:vertAlign w:val="superscript"/>
               </w:rPr>
               <w:t>th</w:t>
             </w:r>
             <w:r>
               <w:rPr>
-                <w:sz w:val="20"/>
+                <w:sz w:val="24"/>
+                <w:szCs w:val="24"/>
               </w:rPr>
               <w:t xml:space="preserve"> Floors</w:t>
             </w:r>
             <w:r>
               <w:rPr>
-                <w:sz w:val="20"/>
+                <w:sz w:val="24"/>
+                <w:szCs w:val="24"/>
               </w:rPr>
               <w:t>)</w:t>
             </w:r>
@@ -668,10 +659,15 @@
             <w:pPr>
               <w:spacing w:before="40" w:after="40"/>
               <w:cnfStyle w:val="000000000000" w:firstRow="0" w:lastRow="0" w:firstColumn="0" w:lastColumn="0" w:oddVBand="0" w:evenVBand="0" w:oddHBand="0" w:evenHBand="0" w:firstRowFirstColumn="0" w:firstRowLastColumn="0" w:lastRowFirstColumn="0" w:lastRowLastColumn="0"/>
+              <w:rPr>
+                <w:sz w:val="24"/>
+                <w:szCs w:val="24"/>
+              </w:rPr>
             </w:pPr>
             <w:r>
               <w:rPr>
-                <w:sz w:val="20"/>
+                <w:sz w:val="24"/>
+                <w:szCs w:val="24"/>
               </w:rPr>
               <w:t>173</w:t>
             </w:r>
@@ -690,10 +686,15 @@
           <w:p>
             <w:pPr>
               <w:spacing w:before="40" w:after="40"/>
+              <w:rPr>
+                <w:sz w:val="24"/>
+                <w:szCs w:val="24"/>
+              </w:rPr>
             </w:pPr>
             <w:r>
               <w:rPr>
-                <w:sz w:val="20"/>
+                <w:sz w:val="24"/>
+                <w:szCs w:val="24"/>
               </w:rPr>
               <w:t>Median</w:t>
             </w:r>
@@ -707,10 +708,15 @@
             <w:pPr>
               <w:spacing w:before="40" w:after="40"/>
               <w:cnfStyle w:val="000000100000" w:firstRow="0" w:lastRow="0" w:firstColumn="0" w:lastColumn="0" w:oddVBand="0" w:evenVBand="0" w:oddHBand="1" w:evenHBand="0" w:firstRowFirstColumn="0" w:firstRowLastColumn="0" w:lastRowFirstColumn="0" w:lastRowLastColumn="0"/>
+              <w:rPr>
+                <w:sz w:val="24"/>
+                <w:szCs w:val="24"/>
+              </w:rPr>
             </w:pPr>
             <w:r>
               <w:rPr>
-                <w:sz w:val="20"/>
+                <w:sz w:val="24"/>
+                <w:szCs w:val="24"/>
               </w:rPr>
               <w:t>170</w:t>
             </w:r>
@@ -726,10 +732,15 @@
           <w:p>
             <w:pPr>
               <w:spacing w:before="40" w:after="40"/>
+              <w:rPr>
+                <w:sz w:val="24"/>
+                <w:szCs w:val="24"/>
+              </w:rPr>
             </w:pPr>
             <w:r>
               <w:rPr>
-                <w:sz w:val="20"/>
+                <w:sz w:val="24"/>
+                <w:szCs w:val="24"/>
               </w:rPr>
               <w:t>Peak</w:t>
             </w:r>
@@ -743,10 +754,15 @@
             <w:pPr>
               <w:spacing w:before="40" w:after="40"/>
               <w:cnfStyle w:val="000000000000" w:firstRow="0" w:lastRow="0" w:firstColumn="0" w:lastColumn="0" w:oddVBand="0" w:evenVBand="0" w:oddHBand="0" w:evenHBand="0" w:firstRowFirstColumn="0" w:firstRowLastColumn="0" w:lastRowFirstColumn="0" w:lastRowLastColumn="0"/>
+              <w:rPr>
+                <w:sz w:val="24"/>
+                <w:szCs w:val="24"/>
+              </w:rPr>
             </w:pPr>
             <w:r>
               <w:rPr>
-                <w:sz w:val="20"/>
+                <w:sz w:val="24"/>
+                <w:szCs w:val="24"/>
               </w:rPr>
               <w:t>317</w:t>
             </w:r>
@@ -765,10 +781,15 @@
           <w:p>
             <w:pPr>
               <w:spacing w:before="40" w:after="40"/>
+              <w:rPr>
+                <w:sz w:val="24"/>
+                <w:szCs w:val="24"/>
+              </w:rPr>
             </w:pPr>
             <w:r>
               <w:rPr>
-                <w:sz w:val="20"/>
+                <w:sz w:val="24"/>
+                <w:szCs w:val="24"/>
               </w:rPr>
               <w:t>95th percentile (capacity fallback)</w:t>
             </w:r>
@@ -782,10 +803,15 @@
             <w:pPr>
               <w:spacing w:before="40" w:after="40"/>
               <w:cnfStyle w:val="000000100000" w:firstRow="0" w:lastRow="0" w:firstColumn="0" w:lastColumn="0" w:oddVBand="0" w:evenVBand="0" w:oddHBand="1" w:evenHBand="0" w:firstRowFirstColumn="0" w:firstRowLastColumn="0" w:lastRowFirstColumn="0" w:lastRowLastColumn="0"/>
+              <w:rPr>
+                <w:sz w:val="24"/>
+                <w:szCs w:val="24"/>
+              </w:rPr>
             </w:pPr>
             <w:r>
               <w:rPr>
-                <w:sz w:val="20"/>
+                <w:sz w:val="24"/>
+                <w:szCs w:val="24"/>
               </w:rPr>
               <w:t>239</w:t>
             </w:r>
@@ -801,10 +827,15 @@
           <w:p>
             <w:pPr>
               <w:spacing w:before="40" w:after="40"/>
+              <w:rPr>
+                <w:sz w:val="24"/>
+                <w:szCs w:val="24"/>
+              </w:rPr>
             </w:pPr>
             <w:r>
               <w:rPr>
-                <w:sz w:val="20"/>
+                <w:sz w:val="24"/>
+                <w:szCs w:val="24"/>
               </w:rPr>
               <w:t>Peak hour</w:t>
             </w:r>
@@ -818,10 +849,15 @@
             <w:pPr>
               <w:spacing w:before="40" w:after="40"/>
               <w:cnfStyle w:val="000000000000" w:firstRow="0" w:lastRow="0" w:firstColumn="0" w:lastColumn="0" w:oddVBand="0" w:evenVBand="0" w:oddHBand="0" w:evenHBand="0" w:firstRowFirstColumn="0" w:firstRowLastColumn="0" w:lastRowFirstColumn="0" w:lastRowLastColumn="0"/>
+              <w:rPr>
+                <w:sz w:val="24"/>
+                <w:szCs w:val="24"/>
+              </w:rPr>
             </w:pPr>
             <w:r>
               <w:rPr>
-                <w:sz w:val="20"/>
+                <w:sz w:val="24"/>
+                <w:szCs w:val="24"/>
               </w:rPr>
               <w:t>5:00 PM (mean 193)</w:t>
             </w:r>
@@ -840,10 +876,15 @@
           <w:p>
             <w:pPr>
               <w:spacing w:before="40" w:after="40"/>
+              <w:rPr>
+                <w:sz w:val="24"/>
+                <w:szCs w:val="24"/>
+              </w:rPr>
             </w:pPr>
             <w:r>
               <w:rPr>
-                <w:sz w:val="20"/>
+                <w:sz w:val="24"/>
+                <w:szCs w:val="24"/>
               </w:rPr>
               <w:t>Share of slots over capacity</w:t>
             </w:r>
@@ -857,10 +898,15 @@
             <w:pPr>
               <w:spacing w:before="40" w:after="40"/>
               <w:cnfStyle w:val="000000100000" w:firstRow="0" w:lastRow="0" w:firstColumn="0" w:lastColumn="0" w:oddVBand="0" w:evenVBand="0" w:oddHBand="1" w:evenHBand="0" w:firstRowFirstColumn="0" w:firstRowLastColumn="0" w:lastRowFirstColumn="0" w:lastRowLastColumn="0"/>
+              <w:rPr>
+                <w:sz w:val="24"/>
+                <w:szCs w:val="24"/>
+              </w:rPr>
             </w:pPr>
             <w:r>
               <w:rPr>
-                <w:sz w:val="20"/>
+                <w:sz w:val="24"/>
+                <w:szCs w:val="24"/>
               </w:rPr>
               <w:t>4.6%</w:t>
             </w:r>
@@ -876,10 +922,15 @@
           <w:p>
             <w:pPr>
               <w:spacing w:before="40" w:after="40"/>
+              <w:rPr>
+                <w:sz w:val="24"/>
+                <w:szCs w:val="24"/>
+              </w:rPr>
             </w:pPr>
             <w:r>
               <w:rPr>
-                <w:sz w:val="20"/>
+                <w:sz w:val="24"/>
+                <w:szCs w:val="24"/>
               </w:rPr>
               <w:t>Coefficient of variation</w:t>
             </w:r>
@@ -893,10 +944,15 @@
             <w:pPr>
               <w:spacing w:before="40" w:after="40"/>
               <w:cnfStyle w:val="000000000000" w:firstRow="0" w:lastRow="0" w:firstColumn="0" w:lastColumn="0" w:oddVBand="0" w:evenVBand="0" w:oddHBand="0" w:evenHBand="0" w:firstRowFirstColumn="0" w:firstRowLastColumn="0" w:lastRowFirstColumn="0" w:lastRowLastColumn="0"/>
+              <w:rPr>
+                <w:sz w:val="24"/>
+                <w:szCs w:val="24"/>
+              </w:rPr>
             </w:pPr>
             <w:r>
               <w:rPr>
-                <w:sz w:val="20"/>
+                <w:sz w:val="24"/>
+                <w:szCs w:val="24"/>
               </w:rPr>
               <w:t>0.24</w:t>
             </w:r>
@@ -915,10 +971,15 @@
           <w:p>
             <w:pPr>
               <w:spacing w:before="40" w:after="40"/>
+              <w:rPr>
+                <w:sz w:val="24"/>
+                <w:szCs w:val="24"/>
+              </w:rPr>
             </w:pPr>
             <w:r>
               <w:rPr>
-                <w:sz w:val="20"/>
+                <w:sz w:val="24"/>
+                <w:szCs w:val="24"/>
               </w:rPr>
               <w:t>Lag-1 autocorrelation (adjacent slots)</w:t>
             </w:r>
@@ -932,10 +993,15 @@
             <w:pPr>
               <w:spacing w:before="40" w:after="40"/>
               <w:cnfStyle w:val="000000100000" w:firstRow="0" w:lastRow="0" w:firstColumn="0" w:lastColumn="0" w:oddVBand="0" w:evenVBand="0" w:oddHBand="1" w:evenHBand="0" w:firstRowFirstColumn="0" w:firstRowLastColumn="0" w:lastRowFirstColumn="0" w:lastRowLastColumn="0"/>
+              <w:rPr>
+                <w:sz w:val="24"/>
+                <w:szCs w:val="24"/>
+              </w:rPr>
             </w:pPr>
             <w:r>
               <w:rPr>
-                <w:sz w:val="20"/>
+                <w:sz w:val="24"/>
+                <w:szCs w:val="24"/>
               </w:rPr>
               <w:t>0.75</w:t>
             </w:r>
@@ -956,7 +1022,6 @@
         <w:rPr>
           <w:rFonts w:eastAsia="Calibri"/>
           <w:i/>
-          <w:sz w:val="20"/>
         </w:rPr>
         <w:t xml:space="preserve">Posted </w:t>
       </w:r>
@@ -964,7 +1029,6 @@
         <w:rPr>
           <w:rFonts w:eastAsia="Calibri"/>
           <w:i/>
-          <w:sz w:val="20"/>
         </w:rPr>
         <w:t>1</w:t>
       </w:r>
@@ -972,7 +1036,6 @@
         <w:rPr>
           <w:rFonts w:eastAsia="Calibri"/>
           <w:i/>
-          <w:sz w:val="20"/>
           <w:vertAlign w:val="superscript"/>
         </w:rPr>
         <w:t>st</w:t>
@@ -981,7 +1044,6 @@
         <w:rPr>
           <w:rFonts w:eastAsia="Calibri"/>
           <w:i/>
-          <w:sz w:val="20"/>
         </w:rPr>
         <w:t xml:space="preserve"> Floor</w:t>
       </w:r>
@@ -989,7 +1051,6 @@
         <w:rPr>
           <w:rFonts w:eastAsia="Calibri"/>
           <w:i/>
-          <w:sz w:val="20"/>
         </w:rPr>
         <w:t xml:space="preserve"> / 4</w:t>
       </w:r>
@@ -997,7 +1058,6 @@
         <w:rPr>
           <w:rFonts w:eastAsia="Calibri"/>
           <w:i/>
-          <w:sz w:val="20"/>
           <w:vertAlign w:val="superscript"/>
         </w:rPr>
         <w:t>th</w:t>
@@ -1006,7 +1066,6 @@
         <w:rPr>
           <w:rFonts w:eastAsia="Calibri"/>
           <w:i/>
-          <w:sz w:val="20"/>
         </w:rPr>
         <w:t xml:space="preserve"> Floor</w:t>
       </w:r>
@@ -1014,84 +1073,50 @@
         <w:rPr>
           <w:rFonts w:eastAsia="Calibri"/>
           <w:i/>
-          <w:sz w:val="20"/>
         </w:rPr>
-        <w:t xml:space="preserve"> capacities from Rec Services are not in yet, so capacity is the 95th percentile of the same evening window. If we get a posted </w:t>
+        <w:t xml:space="preserve"> capacities from Rec Services are not in yet, so capacity is the 95th percentile of the same evening window. If we get a posted number we will rerun with capacity ±10%.</w:t>
       </w:r>
-      <w:proofErr w:type="gramStart"/>
+    </w:p>
+    <w:p>
+      <w:pPr>
+        <w:spacing w:after="160"/>
+        <w:rPr>
+          <w:sz w:val="24"/>
+          <w:szCs w:val="24"/>
+        </w:rPr>
+      </w:pPr>
       <w:r>
         <w:rPr>
           <w:rFonts w:eastAsia="Calibri"/>
-          <w:i/>
-          <w:sz w:val="20"/>
+          <w:sz w:val="24"/>
+          <w:szCs w:val="24"/>
         </w:rPr>
-        <w:t>number</w:t>
+        <w:t>NetLogo runs stay small by scaling the same ratios down to 100 agents: unscaled population is 2 × peak (634 people, capacity 239); scaled run uses N = 100 and C = 38. History is seeded from the real per-slot means, not from random 100.</w:t>
       </w:r>
-      <w:proofErr w:type="gramEnd"/>
+    </w:p>
+    <w:p>
+      <w:pPr>
+        <w:pStyle w:val="Heading2"/>
+      </w:pPr>
+      <w:r>
+        <w:t>Evening profile</w:t>
+      </w:r>
+    </w:p>
+    <w:p>
+      <w:pPr>
+        <w:spacing w:after="160"/>
+        <w:rPr>
+          <w:sz w:val="24"/>
+          <w:szCs w:val="24"/>
+        </w:rPr>
+      </w:pPr>
       <w:r>
         <w:rPr>
           <w:rFonts w:eastAsia="Calibri"/>
-          <w:i/>
-          <w:sz w:val="20"/>
+          <w:sz w:val="24"/>
+          <w:szCs w:val="24"/>
         </w:rPr>
-        <w:t xml:space="preserve"> we will rerun with capacity ±10%.</w:t>
-      </w:r>
-    </w:p>
-    <w:p>
-      <w:pPr>
-        <w:spacing w:after="160"/>
-      </w:pPr>
-      <w:proofErr w:type="spellStart"/>
-      <w:r>
-        <w:rPr>
-          <w:rFonts w:eastAsia="Calibri"/>
-        </w:rPr>
-        <w:t>NetLogo</w:t>
-      </w:r>
-      <w:proofErr w:type="spellEnd"/>
-      <w:r>
-        <w:rPr>
-          <w:rFonts w:eastAsia="Calibri"/>
-        </w:rPr>
-        <w:t xml:space="preserve"> runs stay small by scaling the same ratios down to 100 agents: unscaled population is 2 × peak (634 people, capacity 239); scaled run uses N = 100 and C = 38. History is seeded from the real per-slot means, not from random 100.</w:t>
-      </w:r>
-    </w:p>
-    <w:p>
-      <w:pPr>
-        <w:pStyle w:val="Heading2"/>
-      </w:pPr>
-      <w:r>
-        <w:t xml:space="preserve">Evening </w:t>
-      </w:r>
-      <w:proofErr w:type="gramStart"/>
-      <w:r>
-        <w:t>profile</w:t>
-      </w:r>
-      <w:proofErr w:type="gramEnd"/>
-    </w:p>
-    <w:p>
-      <w:pPr>
-        <w:spacing w:after="160"/>
-      </w:pPr>
-      <w:r>
-        <w:rPr>
-          <w:rFonts w:eastAsia="Calibri"/>
-        </w:rPr>
-        <w:t xml:space="preserve">The real curve rises into </w:t>
-      </w:r>
-      <w:proofErr w:type="gramStart"/>
-      <w:r>
-        <w:rPr>
-          <w:rFonts w:eastAsia="Calibri"/>
-        </w:rPr>
-        <w:t>the 5</w:t>
-      </w:r>
-      <w:proofErr w:type="gramEnd"/>
-      <w:r>
-        <w:rPr>
-          <w:rFonts w:eastAsia="Calibri"/>
-        </w:rPr>
-        <w:t>:00 PM hour and then falls. That shape is what we will compare the “none” simulation against.</w:t>
+        <w:t>The real curve rises into the 5:00 PM hour and then falls. That shape is what we will compare the “none” simulation against.</w:t>
       </w:r>
     </w:p>
     <w:p>
@@ -1212,115 +1237,107 @@
     <w:p>
       <w:pPr>
         <w:spacing w:after="160"/>
+        <w:rPr>
+          <w:sz w:val="24"/>
+          <w:szCs w:val="24"/>
+        </w:rPr>
       </w:pPr>
       <w:r>
         <w:rPr>
           <w:rFonts w:eastAsia="Calibri"/>
+          <w:sz w:val="24"/>
+          <w:szCs w:val="24"/>
         </w:rPr>
-        <w:t xml:space="preserve">We start from the </w:t>
+        <w:t>We start from the NetLogo El Farol model (Rand and Wilensky, 2007) and leave the strategy code alone. What changes is the decision and the information: one Thursday night becomes twelve evening slots, and agents may see a live or delayed count from earlier tonight.</w:t>
       </w:r>
-      <w:proofErr w:type="spellStart"/>
+    </w:p>
+    <w:p>
+      <w:pPr>
+        <w:spacing w:after="160"/>
+        <w:rPr>
+          <w:sz w:val="24"/>
+          <w:szCs w:val="24"/>
+        </w:rPr>
+      </w:pPr>
       <w:r>
         <w:rPr>
           <w:rFonts w:eastAsia="Calibri"/>
+          <w:sz w:val="24"/>
+          <w:szCs w:val="24"/>
         </w:rPr>
-        <w:t>NetLogo</w:t>
+        <w:t>N agents, K = 12 slots (4:00 PM–10:00 PM). Each agent wants one workout per day. Action a_i is a slot in {1…K} or skip. If the agent goes and the slot ends at or under capacity C, payoff is 1. If the slot is over capacity, payoff is 0. Skip is also 0.</w:t>
       </w:r>
-      <w:proofErr w:type="spellEnd"/>
+    </w:p>
+    <w:p>
+      <w:pPr>
+        <w:spacing w:after="160"/>
+        <w:rPr>
+          <w:sz w:val="24"/>
+          <w:szCs w:val="24"/>
+        </w:rPr>
+      </w:pPr>
       <w:r>
         <w:rPr>
           <w:rFonts w:eastAsia="Calibri"/>
+          <w:sz w:val="24"/>
+          <w:szCs w:val="24"/>
         </w:rPr>
-        <w:t xml:space="preserve"> El Farol model (Rand and Wilensky, 2007) and leave the strategy code alone. What changes is the decision and the information: one Thursday night becomes twelve evening slots, and agents may see a live or delayed count from earlier tonight.</w:t>
+        <w:t>Each agent holds S random linear predictors (default S = 10) over the last M days of that slot, and uses the one with the lowest mean absolute error. That is Arthur’s inductive setup, just one history list per slot instead of one Thursday list.</w:t>
       </w:r>
     </w:p>
     <w:p>
       <w:pPr>
         <w:spacing w:after="160"/>
+        <w:rPr>
+          <w:sz w:val="24"/>
+          <w:szCs w:val="24"/>
+        </w:rPr>
       </w:pPr>
       <w:r>
         <w:rPr>
           <w:rFonts w:eastAsia="Calibri"/>
-        </w:rPr>
-        <w:t xml:space="preserve">N agents, K = 12 slots (4:00 PM–10:00 PM). Each agent wants one workout per day. Action </w:t>
-      </w:r>
-      <w:proofErr w:type="spellStart"/>
-      <w:r>
-        <w:rPr>
-          <w:rFonts w:eastAsia="Calibri"/>
-        </w:rPr>
-        <w:t>a_i</w:t>
-      </w:r>
-      <w:proofErr w:type="spellEnd"/>
-      <w:r>
-        <w:rPr>
-          <w:rFonts w:eastAsia="Calibri"/>
-        </w:rPr>
-        <w:t xml:space="preserve"> is a slot in {1…K} or skip. If the agent goes and the slot ends at or under capacity C, payoff is 1. If the slot is over capacity, payoff is 0. Skip is also 0.</w:t>
-      </w:r>
-    </w:p>
-    <w:p>
-      <w:pPr>
-        <w:spacing w:after="160"/>
-      </w:pPr>
-      <w:r>
-        <w:rPr>
-          <w:rFonts w:eastAsia="Calibri"/>
-        </w:rPr>
-        <w:t xml:space="preserve">Each agent holds S random linear predictors (default S = 10) over the last M days of that </w:t>
-      </w:r>
-      <w:proofErr w:type="gramStart"/>
-      <w:r>
-        <w:rPr>
-          <w:rFonts w:eastAsia="Calibri"/>
-        </w:rPr>
-        <w:t>slot, and</w:t>
-      </w:r>
-      <w:proofErr w:type="gramEnd"/>
-      <w:r>
-        <w:rPr>
-          <w:rFonts w:eastAsia="Calibri"/>
-        </w:rPr>
-        <w:t xml:space="preserve"> uses the one with the lowest mean absolute error. That is Arthur’s inductive setup, just one history list per slot instead of one Thursday list.</w:t>
-      </w:r>
-    </w:p>
-    <w:p>
-      <w:pPr>
-        <w:spacing w:after="160"/>
-      </w:pPr>
-      <w:r>
-        <w:rPr>
-          <w:rFonts w:eastAsia="Calibri"/>
+          <w:sz w:val="24"/>
+          <w:szCs w:val="24"/>
         </w:rPr>
         <w:t>Agents decide slot by slot. At slot s, anyone who has not gone or skipped yet predicts crowding for s and goes if the prediction is ≤ C</w:t>
       </w:r>
       <w:r>
         <w:rPr>
           <w:rFonts w:eastAsia="Calibri"/>
+          <w:sz w:val="24"/>
+          <w:szCs w:val="24"/>
         </w:rPr>
         <w:t>apacity</w:t>
       </w:r>
       <w:r>
         <w:rPr>
           <w:rFonts w:eastAsia="Calibri"/>
+          <w:sz w:val="24"/>
+          <w:szCs w:val="24"/>
         </w:rPr>
         <w:t>,</w:t>
       </w:r>
       <w:r>
         <w:rPr>
           <w:rFonts w:eastAsia="Calibri"/>
+          <w:sz w:val="24"/>
+          <w:szCs w:val="24"/>
         </w:rPr>
         <w:t xml:space="preserve"> </w:t>
       </w:r>
       <w:r>
         <w:rPr>
           <w:rFonts w:eastAsia="Calibri"/>
+          <w:sz w:val="24"/>
+          <w:szCs w:val="24"/>
         </w:rPr>
         <w:t>otherwise,</w:t>
       </w:r>
       <w:r>
         <w:rPr>
           <w:rFonts w:eastAsia="Calibri"/>
+          <w:sz w:val="24"/>
+          <w:szCs w:val="24"/>
         </w:rPr>
         <w:t xml:space="preserve"> they wait. Anyone still waiting at 9:30 PM skips (must-go? is off).</w:t>
       </w:r>
@@ -1328,23 +1345,40 @@
     <w:p>
       <w:pPr>
         <w:spacing w:after="160"/>
+        <w:rPr>
+          <w:sz w:val="24"/>
+          <w:szCs w:val="24"/>
+        </w:rPr>
       </w:pPr>
       <w:r>
         <w:rPr>
           <w:rFonts w:eastAsia="Calibri"/>
+          <w:sz w:val="24"/>
+          <w:szCs w:val="24"/>
         </w:rPr>
         <w:t>The three information conditions are:</w:t>
       </w:r>
     </w:p>
     <w:p>
       <w:pPr>
+        <w:pStyle w:val="ListParagraph"/>
+        <w:numPr>
+          <w:ilvl w:val="0"/>
+          <w:numId w:val="16"/>
+        </w:numPr>
         <w:spacing w:after="80"/>
+        <w:rPr>
+          <w:sz w:val="24"/>
+          <w:szCs w:val="24"/>
+        </w:rPr>
       </w:pPr>
       <w:r>
         <w:rPr>
           <w:rFonts w:eastAsia="Calibri"/>
           <w:b/>
           <w:bCs/>
+          <w:sz w:val="24"/>
+          <w:szCs w:val="24"/>
           <w:u w:val="single"/>
         </w:rPr>
         <w:t>None</w:t>
@@ -1352,19 +1386,32 @@
       <w:r>
         <w:rPr>
           <w:rFonts w:eastAsia="Calibri"/>
+          <w:sz w:val="24"/>
+          <w:szCs w:val="24"/>
         </w:rPr>
         <w:t>: only that slot’s past days. This is classic El Farol.</w:t>
       </w:r>
     </w:p>
     <w:p>
       <w:pPr>
+        <w:pStyle w:val="ListParagraph"/>
+        <w:numPr>
+          <w:ilvl w:val="0"/>
+          <w:numId w:val="16"/>
+        </w:numPr>
         <w:spacing w:after="80"/>
+        <w:rPr>
+          <w:sz w:val="24"/>
+          <w:szCs w:val="24"/>
+        </w:rPr>
       </w:pPr>
       <w:r>
         <w:rPr>
           <w:rFonts w:eastAsia="Calibri"/>
           <w:b/>
           <w:bCs/>
+          <w:sz w:val="24"/>
+          <w:szCs w:val="24"/>
           <w:u w:val="single"/>
         </w:rPr>
         <w:t>Live</w:t>
@@ -1372,19 +1419,32 @@
       <w:r>
         <w:rPr>
           <w:rFonts w:eastAsia="Calibri"/>
+          <w:sz w:val="24"/>
+          <w:szCs w:val="24"/>
         </w:rPr>
         <w:t>: also see the actual count from the previous slot tonight.</w:t>
       </w:r>
     </w:p>
     <w:p>
       <w:pPr>
+        <w:pStyle w:val="ListParagraph"/>
+        <w:numPr>
+          <w:ilvl w:val="0"/>
+          <w:numId w:val="16"/>
+        </w:numPr>
         <w:spacing w:after="160"/>
+        <w:rPr>
+          <w:sz w:val="24"/>
+          <w:szCs w:val="24"/>
+        </w:rPr>
       </w:pPr>
       <w:r>
         <w:rPr>
           <w:rFonts w:eastAsia="Calibri"/>
           <w:b/>
           <w:bCs/>
+          <w:sz w:val="24"/>
+          <w:szCs w:val="24"/>
           <w:u w:val="single"/>
         </w:rPr>
         <w:t>Delayed</w:t>
@@ -1392,6 +1452,8 @@
       <w:r>
         <w:rPr>
           <w:rFonts w:eastAsia="Calibri"/>
+          <w:sz w:val="24"/>
+          <w:szCs w:val="24"/>
         </w:rPr>
         <w:t>: also see the count from delay slots ago. Default delay = 2 (one hour), matching a 30-minute page update plus travel time.</w:t>
       </w:r>
@@ -1399,37 +1461,35 @@
     <w:p>
       <w:pPr>
         <w:spacing w:after="160"/>
+        <w:rPr>
+          <w:sz w:val="24"/>
+          <w:szCs w:val="24"/>
+        </w:rPr>
       </w:pPr>
       <w:r>
         <w:rPr>
           <w:rFonts w:eastAsia="Calibri"/>
+          <w:sz w:val="24"/>
+          <w:szCs w:val="24"/>
         </w:rPr>
-        <w:t xml:space="preserve">In the </w:t>
+        <w:lastRenderedPageBreak/>
+        <w:t>In the NetLogo model, live and delayed blend that intra-day count 50/50 with the inductive prediction. The first slot of the evening has no intra-day signal yet, so it uses the inductive prediction only.</w:t>
       </w:r>
-      <w:proofErr w:type="spellStart"/>
+    </w:p>
+    <w:p>
+      <w:pPr>
+        <w:spacing w:after="160"/>
+        <w:rPr>
+          <w:sz w:val="24"/>
+          <w:szCs w:val="24"/>
+        </w:rPr>
+      </w:pPr>
       <w:r>
         <w:rPr>
           <w:rFonts w:eastAsia="Calibri"/>
+          <w:sz w:val="24"/>
+          <w:szCs w:val="24"/>
         </w:rPr>
-        <w:t>NetLogo</w:t>
-      </w:r>
-      <w:proofErr w:type="spellEnd"/>
-      <w:r>
-        <w:rPr>
-          <w:rFonts w:eastAsia="Calibri"/>
-        </w:rPr>
-        <w:t xml:space="preserve"> model, live and delayed blend that intra-day count 50/50 with the inductive prediction. The first slot of the evening has no intra-day signal yet, so it uses the inductive prediction only.</w:t>
-      </w:r>
-    </w:p>
-    <w:p>
-      <w:pPr>
-        <w:spacing w:after="160"/>
-      </w:pPr>
-      <w:r>
-        <w:rPr>
-          <w:rFonts w:eastAsia="Calibri"/>
-        </w:rPr>
-        <w:lastRenderedPageBreak/>
         <w:t>In short: a congestion / minority game solved by inductive learning (Arthur 1994; Fogel et al. 1999), with an extra intra-day information switch.</w:t>
       </w:r>
     </w:p>
@@ -1456,10 +1516,15 @@
           <w:p>
             <w:pPr>
               <w:spacing w:before="60" w:after="60"/>
+              <w:rPr>
+                <w:sz w:val="24"/>
+                <w:szCs w:val="24"/>
+              </w:rPr>
             </w:pPr>
             <w:r>
               <w:rPr>
-                <w:sz w:val="20"/>
+                <w:sz w:val="24"/>
+                <w:szCs w:val="24"/>
               </w:rPr>
               <w:t>Symbol</w:t>
             </w:r>
@@ -1473,10 +1538,15 @@
             <w:pPr>
               <w:spacing w:before="60" w:after="60"/>
               <w:cnfStyle w:val="100000000000" w:firstRow="1" w:lastRow="0" w:firstColumn="0" w:lastColumn="0" w:oddVBand="0" w:evenVBand="0" w:oddHBand="0" w:evenHBand="0" w:firstRowFirstColumn="0" w:firstRowLastColumn="0" w:lastRowFirstColumn="0" w:lastRowLastColumn="0"/>
+              <w:rPr>
+                <w:sz w:val="24"/>
+                <w:szCs w:val="24"/>
+              </w:rPr>
             </w:pPr>
             <w:r>
               <w:rPr>
-                <w:sz w:val="20"/>
+                <w:sz w:val="24"/>
+                <w:szCs w:val="24"/>
               </w:rPr>
               <w:t>Meaning</w:t>
             </w:r>
@@ -1490,10 +1560,15 @@
             <w:pPr>
               <w:spacing w:before="60" w:after="60"/>
               <w:cnfStyle w:val="100000000000" w:firstRow="1" w:lastRow="0" w:firstColumn="0" w:lastColumn="0" w:oddVBand="0" w:evenVBand="0" w:oddHBand="0" w:evenHBand="0" w:firstRowFirstColumn="0" w:firstRowLastColumn="0" w:lastRowFirstColumn="0" w:lastRowLastColumn="0"/>
+              <w:rPr>
+                <w:sz w:val="24"/>
+                <w:szCs w:val="24"/>
+              </w:rPr>
             </w:pPr>
             <w:r>
               <w:rPr>
-                <w:sz w:val="20"/>
+                <w:sz w:val="24"/>
+                <w:szCs w:val="24"/>
               </w:rPr>
               <w:t>Default</w:t>
             </w:r>
@@ -1512,10 +1587,15 @@
           <w:p>
             <w:pPr>
               <w:spacing w:before="40" w:after="40"/>
+              <w:rPr>
+                <w:sz w:val="24"/>
+                <w:szCs w:val="24"/>
+              </w:rPr>
             </w:pPr>
             <w:r>
               <w:rPr>
-                <w:sz w:val="20"/>
+                <w:sz w:val="24"/>
+                <w:szCs w:val="24"/>
               </w:rPr>
               <w:t>N</w:t>
             </w:r>
@@ -1529,10 +1609,15 @@
             <w:pPr>
               <w:spacing w:before="40" w:after="40"/>
               <w:cnfStyle w:val="000000100000" w:firstRow="0" w:lastRow="0" w:firstColumn="0" w:lastColumn="0" w:oddVBand="0" w:evenVBand="0" w:oddHBand="1" w:evenHBand="0" w:firstRowFirstColumn="0" w:firstRowLastColumn="0" w:lastRowFirstColumn="0" w:lastRowLastColumn="0"/>
+              <w:rPr>
+                <w:sz w:val="24"/>
+                <w:szCs w:val="24"/>
+              </w:rPr>
             </w:pPr>
             <w:r>
               <w:rPr>
-                <w:sz w:val="20"/>
+                <w:sz w:val="24"/>
+                <w:szCs w:val="24"/>
               </w:rPr>
               <w:t>Agents</w:t>
             </w:r>
@@ -1546,10 +1631,15 @@
             <w:pPr>
               <w:spacing w:before="40" w:after="40"/>
               <w:cnfStyle w:val="000000100000" w:firstRow="0" w:lastRow="0" w:firstColumn="0" w:lastColumn="0" w:oddVBand="0" w:evenVBand="0" w:oddHBand="1" w:evenHBand="0" w:firstRowFirstColumn="0" w:firstRowLastColumn="0" w:lastRowFirstColumn="0" w:lastRowLastColumn="0"/>
+              <w:rPr>
+                <w:sz w:val="24"/>
+                <w:szCs w:val="24"/>
+              </w:rPr>
             </w:pPr>
             <w:r>
               <w:rPr>
-                <w:sz w:val="20"/>
+                <w:sz w:val="24"/>
+                <w:szCs w:val="24"/>
               </w:rPr>
               <w:t>100 (scaled)</w:t>
             </w:r>
@@ -1565,10 +1655,15 @@
           <w:p>
             <w:pPr>
               <w:spacing w:before="40" w:after="40"/>
+              <w:rPr>
+                <w:sz w:val="24"/>
+                <w:szCs w:val="24"/>
+              </w:rPr>
             </w:pPr>
             <w:r>
               <w:rPr>
-                <w:sz w:val="20"/>
+                <w:sz w:val="24"/>
+                <w:szCs w:val="24"/>
               </w:rPr>
               <w:t>K</w:t>
             </w:r>
@@ -1582,10 +1677,15 @@
             <w:pPr>
               <w:spacing w:before="40" w:after="40"/>
               <w:cnfStyle w:val="000000000000" w:firstRow="0" w:lastRow="0" w:firstColumn="0" w:lastColumn="0" w:oddVBand="0" w:evenVBand="0" w:oddHBand="0" w:evenHBand="0" w:firstRowFirstColumn="0" w:firstRowLastColumn="0" w:lastRowFirstColumn="0" w:lastRowLastColumn="0"/>
+              <w:rPr>
+                <w:sz w:val="24"/>
+                <w:szCs w:val="24"/>
+              </w:rPr>
             </w:pPr>
             <w:r>
               <w:rPr>
-                <w:sz w:val="20"/>
+                <w:sz w:val="24"/>
+                <w:szCs w:val="24"/>
               </w:rPr>
               <w:t>Evening slots</w:t>
             </w:r>
@@ -1599,10 +1699,15 @@
             <w:pPr>
               <w:spacing w:before="40" w:after="40"/>
               <w:cnfStyle w:val="000000000000" w:firstRow="0" w:lastRow="0" w:firstColumn="0" w:lastColumn="0" w:oddVBand="0" w:evenVBand="0" w:oddHBand="0" w:evenHBand="0" w:firstRowFirstColumn="0" w:firstRowLastColumn="0" w:lastRowFirstColumn="0" w:lastRowLastColumn="0"/>
+              <w:rPr>
+                <w:sz w:val="24"/>
+                <w:szCs w:val="24"/>
+              </w:rPr>
             </w:pPr>
             <w:r>
               <w:rPr>
-                <w:sz w:val="20"/>
+                <w:sz w:val="24"/>
+                <w:szCs w:val="24"/>
               </w:rPr>
               <w:t>12</w:t>
             </w:r>
@@ -1621,10 +1726,15 @@
           <w:p>
             <w:pPr>
               <w:spacing w:before="40" w:after="40"/>
+              <w:rPr>
+                <w:sz w:val="24"/>
+                <w:szCs w:val="24"/>
+              </w:rPr>
             </w:pPr>
             <w:r>
               <w:rPr>
-                <w:sz w:val="20"/>
+                <w:sz w:val="24"/>
+                <w:szCs w:val="24"/>
               </w:rPr>
               <w:t>C</w:t>
             </w:r>
@@ -1638,10 +1748,15 @@
             <w:pPr>
               <w:spacing w:before="40" w:after="40"/>
               <w:cnfStyle w:val="000000100000" w:firstRow="0" w:lastRow="0" w:firstColumn="0" w:lastColumn="0" w:oddVBand="0" w:evenVBand="0" w:oddHBand="1" w:evenHBand="0" w:firstRowFirstColumn="0" w:firstRowLastColumn="0" w:lastRowFirstColumn="0" w:lastRowLastColumn="0"/>
+              <w:rPr>
+                <w:sz w:val="24"/>
+                <w:szCs w:val="24"/>
+              </w:rPr>
             </w:pPr>
             <w:r>
               <w:rPr>
-                <w:sz w:val="20"/>
+                <w:sz w:val="24"/>
+                <w:szCs w:val="24"/>
               </w:rPr>
               <w:t>Capacity</w:t>
             </w:r>
@@ -1655,10 +1770,15 @@
             <w:pPr>
               <w:spacing w:before="40" w:after="40"/>
               <w:cnfStyle w:val="000000100000" w:firstRow="0" w:lastRow="0" w:firstColumn="0" w:lastColumn="0" w:oddVBand="0" w:evenVBand="0" w:oddHBand="1" w:evenHBand="0" w:firstRowFirstColumn="0" w:firstRowLastColumn="0" w:lastRowFirstColumn="0" w:lastRowLastColumn="0"/>
+              <w:rPr>
+                <w:sz w:val="24"/>
+                <w:szCs w:val="24"/>
+              </w:rPr>
             </w:pPr>
             <w:r>
               <w:rPr>
-                <w:sz w:val="20"/>
+                <w:sz w:val="24"/>
+                <w:szCs w:val="24"/>
               </w:rPr>
               <w:t>38 scaled / 239 unscaled</w:t>
             </w:r>
@@ -1674,10 +1794,15 @@
           <w:p>
             <w:pPr>
               <w:spacing w:before="40" w:after="40"/>
+              <w:rPr>
+                <w:sz w:val="24"/>
+                <w:szCs w:val="24"/>
+              </w:rPr>
             </w:pPr>
             <w:r>
               <w:rPr>
-                <w:sz w:val="20"/>
+                <w:sz w:val="24"/>
+                <w:szCs w:val="24"/>
               </w:rPr>
               <w:t>S</w:t>
             </w:r>
@@ -1691,10 +1816,15 @@
             <w:pPr>
               <w:spacing w:before="40" w:after="40"/>
               <w:cnfStyle w:val="000000000000" w:firstRow="0" w:lastRow="0" w:firstColumn="0" w:lastColumn="0" w:oddVBand="0" w:evenVBand="0" w:oddHBand="0" w:evenHBand="0" w:firstRowFirstColumn="0" w:firstRowLastColumn="0" w:lastRowFirstColumn="0" w:lastRowLastColumn="0"/>
+              <w:rPr>
+                <w:sz w:val="24"/>
+                <w:szCs w:val="24"/>
+              </w:rPr>
             </w:pPr>
             <w:r>
               <w:rPr>
-                <w:sz w:val="20"/>
+                <w:sz w:val="24"/>
+                <w:szCs w:val="24"/>
               </w:rPr>
               <w:t>Strategies per agent</w:t>
             </w:r>
@@ -1708,10 +1838,15 @@
             <w:pPr>
               <w:spacing w:before="40" w:after="40"/>
               <w:cnfStyle w:val="000000000000" w:firstRow="0" w:lastRow="0" w:firstColumn="0" w:lastColumn="0" w:oddVBand="0" w:evenVBand="0" w:oddHBand="0" w:evenHBand="0" w:firstRowFirstColumn="0" w:firstRowLastColumn="0" w:lastRowFirstColumn="0" w:lastRowLastColumn="0"/>
+              <w:rPr>
+                <w:sz w:val="24"/>
+                <w:szCs w:val="24"/>
+              </w:rPr>
             </w:pPr>
             <w:r>
               <w:rPr>
-                <w:sz w:val="20"/>
+                <w:sz w:val="24"/>
+                <w:szCs w:val="24"/>
               </w:rPr>
               <w:t>10</w:t>
             </w:r>
@@ -1730,10 +1865,15 @@
           <w:p>
             <w:pPr>
               <w:spacing w:before="40" w:after="40"/>
+              <w:rPr>
+                <w:sz w:val="24"/>
+                <w:szCs w:val="24"/>
+              </w:rPr>
             </w:pPr>
             <w:r>
               <w:rPr>
-                <w:sz w:val="20"/>
+                <w:sz w:val="24"/>
+                <w:szCs w:val="24"/>
               </w:rPr>
               <w:t>M</w:t>
             </w:r>
@@ -1747,10 +1887,15 @@
             <w:pPr>
               <w:spacing w:before="40" w:after="40"/>
               <w:cnfStyle w:val="000000100000" w:firstRow="0" w:lastRow="0" w:firstColumn="0" w:lastColumn="0" w:oddVBand="0" w:evenVBand="0" w:oddHBand="1" w:evenHBand="0" w:firstRowFirstColumn="0" w:firstRowLastColumn="0" w:lastRowFirstColumn="0" w:lastRowLastColumn="0"/>
+              <w:rPr>
+                <w:sz w:val="24"/>
+                <w:szCs w:val="24"/>
+              </w:rPr>
             </w:pPr>
             <w:r>
               <w:rPr>
-                <w:sz w:val="20"/>
+                <w:sz w:val="24"/>
+                <w:szCs w:val="24"/>
               </w:rPr>
               <w:t>Memory (days, per slot)</w:t>
             </w:r>
@@ -1764,10 +1909,15 @@
             <w:pPr>
               <w:spacing w:before="40" w:after="40"/>
               <w:cnfStyle w:val="000000100000" w:firstRow="0" w:lastRow="0" w:firstColumn="0" w:lastColumn="0" w:oddVBand="0" w:evenVBand="0" w:oddHBand="1" w:evenHBand="0" w:firstRowFirstColumn="0" w:firstRowLastColumn="0" w:lastRowFirstColumn="0" w:lastRowLastColumn="0"/>
+              <w:rPr>
+                <w:sz w:val="24"/>
+                <w:szCs w:val="24"/>
+              </w:rPr>
             </w:pPr>
             <w:r>
               <w:rPr>
-                <w:sz w:val="20"/>
+                <w:sz w:val="24"/>
+                <w:szCs w:val="24"/>
               </w:rPr>
               <w:t>1, 5, or 10</w:t>
             </w:r>
@@ -1783,10 +1933,15 @@
           <w:p>
             <w:pPr>
               <w:spacing w:before="40" w:after="40"/>
+              <w:rPr>
+                <w:sz w:val="24"/>
+                <w:szCs w:val="24"/>
+              </w:rPr>
             </w:pPr>
             <w:r>
               <w:rPr>
-                <w:sz w:val="20"/>
+                <w:sz w:val="24"/>
+                <w:szCs w:val="24"/>
               </w:rPr>
               <w:t>delay</w:t>
             </w:r>
@@ -1800,10 +1955,15 @@
             <w:pPr>
               <w:spacing w:before="40" w:after="40"/>
               <w:cnfStyle w:val="000000000000" w:firstRow="0" w:lastRow="0" w:firstColumn="0" w:lastColumn="0" w:oddVBand="0" w:evenVBand="0" w:oddHBand="0" w:evenHBand="0" w:firstRowFirstColumn="0" w:firstRowLastColumn="0" w:lastRowFirstColumn="0" w:lastRowLastColumn="0"/>
+              <w:rPr>
+                <w:sz w:val="24"/>
+                <w:szCs w:val="24"/>
+              </w:rPr>
             </w:pPr>
             <w:r>
               <w:rPr>
-                <w:sz w:val="20"/>
+                <w:sz w:val="24"/>
+                <w:szCs w:val="24"/>
               </w:rPr>
               <w:t>Slots of lag when info = delayed</w:t>
             </w:r>
@@ -1817,10 +1977,15 @@
             <w:pPr>
               <w:spacing w:before="40" w:after="40"/>
               <w:cnfStyle w:val="000000000000" w:firstRow="0" w:lastRow="0" w:firstColumn="0" w:lastColumn="0" w:oddVBand="0" w:evenVBand="0" w:oddHBand="0" w:evenHBand="0" w:firstRowFirstColumn="0" w:firstRowLastColumn="0" w:lastRowFirstColumn="0" w:lastRowLastColumn="0"/>
+              <w:rPr>
+                <w:sz w:val="24"/>
+                <w:szCs w:val="24"/>
+              </w:rPr>
             </w:pPr>
             <w:r>
               <w:rPr>
-                <w:sz w:val="20"/>
+                <w:sz w:val="24"/>
+                <w:szCs w:val="24"/>
               </w:rPr>
               <w:t>2 (1 hour)</w:t>
             </w:r>
@@ -1844,35 +2009,33 @@
     <w:p>
       <w:pPr>
         <w:spacing w:after="160"/>
+        <w:rPr>
+          <w:sz w:val="24"/>
+          <w:szCs w:val="24"/>
+        </w:rPr>
       </w:pPr>
       <w:r>
         <w:rPr>
           <w:rFonts w:eastAsia="Calibri"/>
+          <w:sz w:val="24"/>
+          <w:szCs w:val="24"/>
         </w:rPr>
-        <w:t>Main grid (</w:t>
+        <w:t>Main grid (BehaviorSpace experiment info-memory-grid):</w:t>
       </w:r>
-      <w:proofErr w:type="spellStart"/>
+    </w:p>
+    <w:p>
+      <w:pPr>
+        <w:spacing w:after="80"/>
+        <w:rPr>
+          <w:sz w:val="24"/>
+          <w:szCs w:val="24"/>
+        </w:rPr>
+      </w:pPr>
       <w:r>
         <w:rPr>
           <w:rFonts w:eastAsia="Calibri"/>
-        </w:rPr>
-        <w:t>BehaviorSpace</w:t>
-      </w:r>
-      <w:proofErr w:type="spellEnd"/>
-      <w:r>
-        <w:rPr>
-          <w:rFonts w:eastAsia="Calibri"/>
-        </w:rPr>
-        <w:t xml:space="preserve"> experiment info-memory-grid):</w:t>
-      </w:r>
-    </w:p>
-    <w:p>
-      <w:pPr>
-        <w:spacing w:after="80"/>
-      </w:pPr>
-      <w:r>
-        <w:rPr>
-          <w:rFonts w:eastAsia="Calibri"/>
+          <w:sz w:val="24"/>
+          <w:szCs w:val="24"/>
         </w:rPr>
         <w:t>info-mode: none / live / delayed</w:t>
       </w:r>
@@ -1880,10 +2043,16 @@
     <w:p>
       <w:pPr>
         <w:spacing w:after="80"/>
+        <w:rPr>
+          <w:sz w:val="24"/>
+          <w:szCs w:val="24"/>
+        </w:rPr>
       </w:pPr>
       <w:r>
         <w:rPr>
           <w:rFonts w:eastAsia="Calibri"/>
+          <w:sz w:val="24"/>
+          <w:szCs w:val="24"/>
         </w:rPr>
         <w:t>memory-size: 1, 5, 10 days</w:t>
       </w:r>
@@ -1891,10 +2060,16 @@
     <w:p>
       <w:pPr>
         <w:spacing w:after="80"/>
+        <w:rPr>
+          <w:sz w:val="24"/>
+          <w:szCs w:val="24"/>
+        </w:rPr>
       </w:pPr>
       <w:r>
         <w:rPr>
           <w:rFonts w:eastAsia="Calibri"/>
+          <w:sz w:val="24"/>
+          <w:szCs w:val="24"/>
         </w:rPr>
         <w:t>30 random seeds</w:t>
       </w:r>
@@ -1902,10 +2077,16 @@
     <w:p>
       <w:pPr>
         <w:spacing w:after="80"/>
+        <w:rPr>
+          <w:sz w:val="24"/>
+          <w:szCs w:val="24"/>
+        </w:rPr>
       </w:pPr>
       <w:r>
         <w:rPr>
           <w:rFonts w:eastAsia="Calibri"/>
+          <w:sz w:val="24"/>
+          <w:szCs w:val="24"/>
         </w:rPr>
         <w:t>40 simulated days; first 10 discarded as burn-in</w:t>
       </w:r>
@@ -1913,10 +2094,16 @@
     <w:p>
       <w:pPr>
         <w:spacing w:after="160"/>
+        <w:rPr>
+          <w:sz w:val="24"/>
+          <w:szCs w:val="24"/>
+        </w:rPr>
       </w:pPr>
       <w:r>
         <w:rPr>
           <w:rFonts w:eastAsia="Calibri"/>
+          <w:sz w:val="24"/>
+          <w:szCs w:val="24"/>
         </w:rPr>
         <w:t>Fixed: N = 100, C = 38, S = 10, delay = 2, must-go? off, history seeded from the data</w:t>
       </w:r>
@@ -1924,26 +2111,26 @@
     <w:p>
       <w:pPr>
         <w:spacing w:after="160"/>
+        <w:rPr>
+          <w:sz w:val="24"/>
+          <w:szCs w:val="24"/>
+        </w:rPr>
       </w:pPr>
       <w:r>
         <w:rPr>
           <w:rFonts w:eastAsia="Calibri"/>
+          <w:sz w:val="24"/>
+          <w:szCs w:val="24"/>
         </w:rPr>
-        <w:t xml:space="preserve">A secondary run will vary </w:t>
+        <w:t>A secondary run will vary number-strategies (5 vs 10</w:t>
       </w:r>
-      <w:proofErr w:type="gramStart"/>
       <w:r>
         <w:rPr>
           <w:rFonts w:eastAsia="Calibri"/>
+          <w:sz w:val="24"/>
+          <w:szCs w:val="24"/>
         </w:rPr>
-        <w:t>number-strategies</w:t>
-      </w:r>
-      <w:proofErr w:type="gramEnd"/>
-      <w:r>
-        <w:rPr>
-          <w:rFonts w:eastAsia="Calibri"/>
-        </w:rPr>
-        <w:t xml:space="preserve"> (5 vs 10) and, if Rec Services reply, capacity ±10%.</w:t>
+        <w:t>)</w:t>
       </w:r>
     </w:p>
     <w:p>
@@ -1976,10 +2163,15 @@
           <w:p>
             <w:pPr>
               <w:spacing w:before="60" w:after="60"/>
+              <w:rPr>
+                <w:sz w:val="24"/>
+                <w:szCs w:val="24"/>
+              </w:rPr>
             </w:pPr>
             <w:r>
               <w:rPr>
-                <w:sz w:val="20"/>
+                <w:sz w:val="24"/>
+                <w:szCs w:val="24"/>
               </w:rPr>
               <w:t>Reporter</w:t>
             </w:r>
@@ -1993,10 +2185,15 @@
             <w:pPr>
               <w:spacing w:before="60" w:after="60"/>
               <w:cnfStyle w:val="100000000000" w:firstRow="1" w:lastRow="0" w:firstColumn="0" w:lastColumn="0" w:oddVBand="0" w:evenVBand="0" w:oddHBand="0" w:evenHBand="0" w:firstRowFirstColumn="0" w:firstRowLastColumn="0" w:lastRowFirstColumn="0" w:lastRowLastColumn="0"/>
+              <w:rPr>
+                <w:sz w:val="24"/>
+                <w:szCs w:val="24"/>
+              </w:rPr>
             </w:pPr>
             <w:r>
               <w:rPr>
-                <w:sz w:val="20"/>
+                <w:sz w:val="24"/>
+                <w:szCs w:val="24"/>
               </w:rPr>
               <w:t>What it is</w:t>
             </w:r>
@@ -2015,10 +2212,15 @@
           <w:p>
             <w:pPr>
               <w:spacing w:before="40" w:after="40"/>
+              <w:rPr>
+                <w:sz w:val="24"/>
+                <w:szCs w:val="24"/>
+              </w:rPr>
             </w:pPr>
             <w:r>
               <w:rPr>
-                <w:sz w:val="20"/>
+                <w:sz w:val="24"/>
+                <w:szCs w:val="24"/>
               </w:rPr>
               <w:t>peak-occupancy</w:t>
             </w:r>
@@ -2032,10 +2234,15 @@
             <w:pPr>
               <w:spacing w:before="40" w:after="40"/>
               <w:cnfStyle w:val="000000100000" w:firstRow="0" w:lastRow="0" w:firstColumn="0" w:lastColumn="0" w:oddVBand="0" w:evenVBand="0" w:oddHBand="1" w:evenHBand="0" w:firstRowFirstColumn="0" w:firstRowLastColumn="0" w:lastRowFirstColumn="0" w:lastRowLastColumn="0"/>
+              <w:rPr>
+                <w:sz w:val="24"/>
+                <w:szCs w:val="24"/>
+              </w:rPr>
             </w:pPr>
             <w:r>
               <w:rPr>
-                <w:sz w:val="20"/>
+                <w:sz w:val="24"/>
+                <w:szCs w:val="24"/>
               </w:rPr>
               <w:t>Busiest slot after burn-in</w:t>
             </w:r>
@@ -2051,10 +2258,15 @@
           <w:p>
             <w:pPr>
               <w:spacing w:before="40" w:after="40"/>
+              <w:rPr>
+                <w:sz w:val="24"/>
+                <w:szCs w:val="24"/>
+              </w:rPr>
             </w:pPr>
             <w:r>
               <w:rPr>
-                <w:sz w:val="20"/>
+                <w:sz w:val="24"/>
+                <w:szCs w:val="24"/>
               </w:rPr>
               <w:t>pct-slots-over-capacity</w:t>
             </w:r>
@@ -2068,10 +2280,15 @@
             <w:pPr>
               <w:spacing w:before="40" w:after="40"/>
               <w:cnfStyle w:val="000000000000" w:firstRow="0" w:lastRow="0" w:firstColumn="0" w:lastColumn="0" w:oddVBand="0" w:evenVBand="0" w:oddHBand="0" w:evenHBand="0" w:firstRowFirstColumn="0" w:firstRowLastColumn="0" w:lastRowFirstColumn="0" w:lastRowLastColumn="0"/>
+              <w:rPr>
+                <w:sz w:val="24"/>
+                <w:szCs w:val="24"/>
+              </w:rPr>
             </w:pPr>
             <w:r>
               <w:rPr>
-                <w:sz w:val="20"/>
+                <w:sz w:val="24"/>
+                <w:szCs w:val="24"/>
               </w:rPr>
               <w:t>Share of slots with attendance &gt; C</w:t>
             </w:r>
@@ -2090,10 +2307,15 @@
           <w:p>
             <w:pPr>
               <w:spacing w:before="40" w:after="40"/>
+              <w:rPr>
+                <w:sz w:val="24"/>
+                <w:szCs w:val="24"/>
+              </w:rPr>
             </w:pPr>
             <w:r>
               <w:rPr>
-                <w:sz w:val="20"/>
+                <w:sz w:val="24"/>
+                <w:szCs w:val="24"/>
               </w:rPr>
               <w:t>occupancy-variance</w:t>
             </w:r>
@@ -2107,10 +2329,15 @@
             <w:pPr>
               <w:spacing w:before="40" w:after="40"/>
               <w:cnfStyle w:val="000000100000" w:firstRow="0" w:lastRow="0" w:firstColumn="0" w:lastColumn="0" w:oddVBand="0" w:evenVBand="0" w:oddHBand="1" w:evenHBand="0" w:firstRowFirstColumn="0" w:firstRowLastColumn="0" w:lastRowFirstColumn="0" w:lastRowLastColumn="0"/>
+              <w:rPr>
+                <w:sz w:val="24"/>
+                <w:szCs w:val="24"/>
+              </w:rPr>
             </w:pPr>
             <w:r>
               <w:rPr>
-                <w:sz w:val="20"/>
+                <w:sz w:val="24"/>
+                <w:szCs w:val="24"/>
               </w:rPr>
               <w:t>How much occupancy swings across slots</w:t>
             </w:r>
@@ -2126,10 +2353,15 @@
           <w:p>
             <w:pPr>
               <w:spacing w:before="40" w:after="40"/>
+              <w:rPr>
+                <w:sz w:val="24"/>
+                <w:szCs w:val="24"/>
+              </w:rPr>
             </w:pPr>
             <w:r>
               <w:rPr>
-                <w:sz w:val="20"/>
+                <w:sz w:val="24"/>
+                <w:szCs w:val="24"/>
               </w:rPr>
               <w:t>lag1-autocorr</w:t>
             </w:r>
@@ -2143,26 +2375,17 @@
             <w:pPr>
               <w:spacing w:before="40" w:after="40"/>
               <w:cnfStyle w:val="000000000000" w:firstRow="0" w:lastRow="0" w:firstColumn="0" w:lastColumn="0" w:oddVBand="0" w:evenVBand="0" w:oddHBand="0" w:evenHBand="0" w:firstRowFirstColumn="0" w:firstRowLastColumn="0" w:lastRowFirstColumn="0" w:lastRowLastColumn="0"/>
+              <w:rPr>
+                <w:sz w:val="24"/>
+                <w:szCs w:val="24"/>
+              </w:rPr>
             </w:pPr>
             <w:r>
               <w:rPr>
-                <w:sz w:val="20"/>
+                <w:sz w:val="24"/>
+                <w:szCs w:val="24"/>
               </w:rPr>
-              <w:t xml:space="preserve">Correlation between </w:t>
-            </w:r>
-            <w:proofErr w:type="spellStart"/>
-            <w:r>
-              <w:rPr>
-                <w:sz w:val="20"/>
-              </w:rPr>
-              <w:t>neighbouring</w:t>
-            </w:r>
-            <w:proofErr w:type="spellEnd"/>
-            <w:r>
-              <w:rPr>
-                <w:sz w:val="20"/>
-              </w:rPr>
-              <w:t xml:space="preserve"> slots</w:t>
+              <w:t>Correlation between neighbouring slots</w:t>
             </w:r>
           </w:p>
         </w:tc>
@@ -2179,10 +2402,15 @@
           <w:p>
             <w:pPr>
               <w:spacing w:before="40" w:after="40"/>
+              <w:rPr>
+                <w:sz w:val="24"/>
+                <w:szCs w:val="24"/>
+              </w:rPr>
             </w:pPr>
             <w:r>
               <w:rPr>
-                <w:sz w:val="20"/>
+                <w:sz w:val="24"/>
+                <w:szCs w:val="24"/>
               </w:rPr>
               <w:t>good-visit-rate</w:t>
             </w:r>
@@ -2196,10 +2424,15 @@
             <w:pPr>
               <w:spacing w:before="40" w:after="40"/>
               <w:cnfStyle w:val="000000100000" w:firstRow="0" w:lastRow="0" w:firstColumn="0" w:lastColumn="0" w:oddVBand="0" w:evenVBand="0" w:oddHBand="1" w:evenHBand="0" w:firstRowFirstColumn="0" w:firstRowLastColumn="0" w:lastRowFirstColumn="0" w:lastRowLastColumn="0"/>
+              <w:rPr>
+                <w:sz w:val="24"/>
+                <w:szCs w:val="24"/>
+              </w:rPr>
             </w:pPr>
             <w:r>
               <w:rPr>
-                <w:sz w:val="20"/>
+                <w:sz w:val="24"/>
+                <w:szCs w:val="24"/>
               </w:rPr>
               <w:t>Share of visits that landed at or under C</w:t>
             </w:r>
@@ -2215,10 +2448,15 @@
           <w:p>
             <w:pPr>
               <w:spacing w:before="40" w:after="40"/>
+              <w:rPr>
+                <w:sz w:val="24"/>
+                <w:szCs w:val="24"/>
+              </w:rPr>
             </w:pPr>
             <w:r>
               <w:rPr>
-                <w:sz w:val="20"/>
+                <w:sz w:val="24"/>
+                <w:szCs w:val="24"/>
               </w:rPr>
               <w:t>skip-rate</w:t>
             </w:r>
@@ -2232,10 +2470,15 @@
             <w:pPr>
               <w:spacing w:before="40" w:after="40"/>
               <w:cnfStyle w:val="000000000000" w:firstRow="0" w:lastRow="0" w:firstColumn="0" w:lastColumn="0" w:oddVBand="0" w:evenVBand="0" w:oddHBand="0" w:evenHBand="0" w:firstRowFirstColumn="0" w:firstRowLastColumn="0" w:lastRowFirstColumn="0" w:lastRowLastColumn="0"/>
+              <w:rPr>
+                <w:sz w:val="24"/>
+                <w:szCs w:val="24"/>
+              </w:rPr>
             </w:pPr>
             <w:r>
               <w:rPr>
-                <w:sz w:val="20"/>
+                <w:sz w:val="24"/>
+                <w:szCs w:val="24"/>
               </w:rPr>
               <w:t>Share of agent-days that skipped</w:t>
             </w:r>
@@ -2253,67 +2496,88 @@
         <w:pStyle w:val="Heading2"/>
       </w:pPr>
       <w:r>
+        <w:lastRenderedPageBreak/>
         <w:t>Three analyses</w:t>
       </w:r>
     </w:p>
     <w:p>
       <w:pPr>
+        <w:pStyle w:val="ListParagraph"/>
+        <w:numPr>
+          <w:ilvl w:val="0"/>
+          <w:numId w:val="13"/>
+        </w:numPr>
         <w:spacing w:after="120"/>
+        <w:rPr>
+          <w:sz w:val="24"/>
+          <w:szCs w:val="24"/>
+        </w:rPr>
       </w:pPr>
       <w:r>
         <w:rPr>
           <w:rFonts w:eastAsia="Calibri"/>
+          <w:sz w:val="24"/>
+          <w:szCs w:val="24"/>
         </w:rPr>
-        <w:t>1. Main effect of information. Does live lower pct-slots-over-capacity and peak-occupancy relative to none? Does delayed look more oscillatory (higher lag-1 autocorrelation and higher variance)? This is the proposal question.</w:t>
+        <w:t>Main effect of information. Does live lower pct-slots-over-capacity and peak-occupancy relative to none? Does delayed look more oscillatory (higher lag-1 autocorrelation and higher variance)? This is the proposal question.</w:t>
       </w:r>
     </w:p>
     <w:p>
       <w:pPr>
+        <w:pStyle w:val="ListParagraph"/>
+        <w:numPr>
+          <w:ilvl w:val="0"/>
+          <w:numId w:val="13"/>
+        </w:numPr>
         <w:spacing w:after="120"/>
+        <w:rPr>
+          <w:sz w:val="24"/>
+          <w:szCs w:val="24"/>
+        </w:rPr>
       </w:pPr>
       <w:r>
         <w:rPr>
           <w:rFonts w:eastAsia="Calibri"/>
+          <w:sz w:val="24"/>
+          <w:szCs w:val="24"/>
         </w:rPr>
-        <w:t>2. Memory × information. A heatmap of over-capacity % across the 3 × 3 grid.</w:t>
+        <w:t>Memory × information. A heatmap of over-capacity % across the 3 × 3 grid.</w:t>
       </w:r>
     </w:p>
     <w:p>
       <w:pPr>
+        <w:pStyle w:val="ListParagraph"/>
+        <w:numPr>
+          <w:ilvl w:val="0"/>
+          <w:numId w:val="13"/>
+        </w:numPr>
         <w:spacing w:after="160"/>
+        <w:rPr>
+          <w:sz w:val="24"/>
+          <w:szCs w:val="24"/>
+        </w:rPr>
       </w:pPr>
       <w:r>
         <w:rPr>
           <w:rFonts w:eastAsia="Calibri"/>
+          <w:sz w:val="24"/>
+          <w:szCs w:val="24"/>
         </w:rPr>
-        <w:lastRenderedPageBreak/>
-        <w:t xml:space="preserve">3. Validation. Compare the none condition to the real evening curve in Figure 1 (shape and % over capacity). We will </w:t>
+        <w:t xml:space="preserve">Validation. Compare the none condition to the real evening curve in Figure 1 (shape and % over capacity). We will report mean absolute error between the simulated and real profiles after both are </w:t>
       </w:r>
-      <w:proofErr w:type="gramStart"/>
       <w:r>
         <w:rPr>
           <w:rFonts w:eastAsia="Calibri"/>
+          <w:sz w:val="24"/>
+          <w:szCs w:val="24"/>
         </w:rPr>
-        <w:t>report mean</w:t>
+        <w:t>normalized</w:t>
       </w:r>
-      <w:proofErr w:type="gramEnd"/>
       <w:r>
         <w:rPr>
           <w:rFonts w:eastAsia="Calibri"/>
-        </w:rPr>
-        <w:t xml:space="preserve"> absolute error between the simulated and real profiles after both are </w:t>
-      </w:r>
-      <w:proofErr w:type="spellStart"/>
-      <w:r>
-        <w:rPr>
-          <w:rFonts w:eastAsia="Calibri"/>
-        </w:rPr>
-        <w:t>normalised</w:t>
-      </w:r>
-      <w:proofErr w:type="spellEnd"/>
-      <w:r>
-        <w:rPr>
-          <w:rFonts w:eastAsia="Calibri"/>
+          <w:sz w:val="24"/>
+          <w:szCs w:val="24"/>
         </w:rPr>
         <w:t>.</w:t>
       </w:r>
@@ -2321,26 +2585,26 @@
     <w:p>
       <w:pPr>
         <w:spacing w:after="160"/>
+        <w:rPr>
+          <w:sz w:val="24"/>
+          <w:szCs w:val="24"/>
+        </w:rPr>
       </w:pPr>
       <w:r>
         <w:rPr>
           <w:rFonts w:eastAsia="Calibri"/>
+          <w:sz w:val="24"/>
+          <w:szCs w:val="24"/>
         </w:rPr>
-        <w:t xml:space="preserve">Analysis is in Python from the </w:t>
+        <w:t>Analysis is in Python from the BehaviorSpace CSV. We already ran a 5-seed 3 × 3 pilot. The 12-slot model finished in under a minute</w:t>
       </w:r>
-      <w:proofErr w:type="spellStart"/>
       <w:r>
         <w:rPr>
           <w:rFonts w:eastAsia="Calibri"/>
+          <w:sz w:val="24"/>
+          <w:szCs w:val="24"/>
         </w:rPr>
-        <w:t>BehaviorSpace</w:t>
-      </w:r>
-      <w:proofErr w:type="spellEnd"/>
-      <w:r>
-        <w:rPr>
-          <w:rFonts w:eastAsia="Calibri"/>
-        </w:rPr>
-        <w:t xml:space="preserve"> CSV. We already ran a 5-seed 3 × 3 pilot. The 12-slot model finished in under a minute, so we are keeping the slot model and not falling back to a single-slot version. The 30-seed grid is the confirmatory run; the pilot is not a result.</w:t>
+        <w:t>.</w:t>
       </w:r>
     </w:p>
     <w:p>
@@ -2353,60 +2617,114 @@
     </w:p>
     <w:p>
       <w:pPr>
+        <w:pStyle w:val="ListParagraph"/>
+        <w:numPr>
+          <w:ilvl w:val="0"/>
+          <w:numId w:val="17"/>
+        </w:numPr>
         <w:spacing w:after="80"/>
+        <w:rPr>
+          <w:sz w:val="24"/>
+          <w:szCs w:val="24"/>
+        </w:rPr>
       </w:pPr>
       <w:r>
         <w:rPr>
           <w:rFonts w:eastAsia="Calibri"/>
+          <w:sz w:val="24"/>
+          <w:szCs w:val="24"/>
         </w:rPr>
-        <w:t xml:space="preserve">Staff counts are noisy and not every </w:t>
+        <w:t>Staff counts are noisy and not every half-hour is posted.</w:t>
       </w:r>
-      <w:proofErr w:type="gramStart"/>
+    </w:p>
+    <w:p>
+      <w:pPr>
+        <w:pStyle w:val="ListParagraph"/>
+        <w:numPr>
+          <w:ilvl w:val="0"/>
+          <w:numId w:val="17"/>
+        </w:numPr>
+        <w:spacing w:after="80"/>
+        <w:rPr>
+          <w:sz w:val="24"/>
+          <w:szCs w:val="24"/>
+        </w:rPr>
+      </w:pPr>
       <w:r>
         <w:rPr>
           <w:rFonts w:eastAsia="Calibri"/>
-        </w:rPr>
-        <w:t>half-hour</w:t>
-      </w:r>
-      <w:proofErr w:type="gramEnd"/>
-      <w:r>
-        <w:rPr>
-          <w:rFonts w:eastAsia="Calibri"/>
-        </w:rPr>
-        <w:t xml:space="preserve"> is posted.</w:t>
-      </w:r>
-    </w:p>
-    <w:p>
-      <w:pPr>
-        <w:spacing w:after="80"/>
-      </w:pPr>
-      <w:r>
-        <w:rPr>
-          <w:rFonts w:eastAsia="Calibri"/>
+          <w:sz w:val="24"/>
+          <w:szCs w:val="24"/>
         </w:rPr>
         <w:t>Agents are identical. Real gym users are not.</w:t>
       </w:r>
     </w:p>
     <w:p>
       <w:pPr>
+        <w:pStyle w:val="ListParagraph"/>
+        <w:numPr>
+          <w:ilvl w:val="0"/>
+          <w:numId w:val="17"/>
+        </w:numPr>
         <w:spacing w:after="80"/>
+        <w:rPr>
+          <w:sz w:val="24"/>
+          <w:szCs w:val="24"/>
+        </w:rPr>
       </w:pPr>
       <w:r>
         <w:rPr>
           <w:rFonts w:eastAsia="Calibri"/>
+          <w:sz w:val="24"/>
+          <w:szCs w:val="24"/>
         </w:rPr>
-        <w:t>We only model weekday evenings, not mornings, Fridays, or weekends.</w:t>
+        <w:t>We only model</w:t>
+      </w:r>
+      <w:r>
+        <w:rPr>
+          <w:rFonts w:eastAsia="Calibri"/>
+          <w:sz w:val="24"/>
+          <w:szCs w:val="24"/>
+        </w:rPr>
+        <w:t>ed</w:t>
+      </w:r>
+      <w:r>
+        <w:rPr>
+          <w:rFonts w:eastAsia="Calibri"/>
+          <w:sz w:val="24"/>
+          <w:szCs w:val="24"/>
+        </w:rPr>
+        <w:t xml:space="preserve"> weekday evenings, not mornings, Fridays, or weekends.</w:t>
       </w:r>
     </w:p>
     <w:p>
       <w:pPr>
+        <w:pStyle w:val="ListParagraph"/>
+        <w:numPr>
+          <w:ilvl w:val="0"/>
+          <w:numId w:val="17"/>
+        </w:numPr>
         <w:spacing w:after="160"/>
+        <w:rPr>
+          <w:sz w:val="24"/>
+          <w:szCs w:val="24"/>
+        </w:rPr>
       </w:pPr>
       <w:r>
         <w:rPr>
           <w:rFonts w:eastAsia="Calibri"/>
+          <w:sz w:val="24"/>
+          <w:szCs w:val="24"/>
         </w:rPr>
-        <w:t>Capacity is a percentile fallback until Rec Services send a posted number.</w:t>
+        <w:t>Capacity is a percentile fallback</w:t>
+      </w:r>
+      <w:r>
+        <w:rPr>
+          <w:rFonts w:eastAsia="Calibri"/>
+          <w:sz w:val="24"/>
+          <w:szCs w:val="24"/>
+        </w:rPr>
+        <w:t>, not an accurate value.</w:t>
       </w:r>
     </w:p>
     <w:p>
@@ -2450,51 +2768,19 @@
           <w:rFonts w:eastAsia="Calibri"/>
           <w:sz w:val="20"/>
         </w:rPr>
-        <w:t xml:space="preserve">Rand, W., &amp; Wilensky, U. (2007). </w:t>
+        <w:t>Rand, W., &amp; Wilensky, U. (2007). NetLogo El Farol model. Center for Connected Learning, Northwestern University. https://ccl.northwestern.edu/netlogo/models/ElFarol</w:t>
       </w:r>
-      <w:proofErr w:type="spellStart"/>
+    </w:p>
+    <w:p>
+      <w:pPr>
+        <w:spacing w:after="80"/>
+      </w:pPr>
       <w:r>
         <w:rPr>
           <w:rFonts w:eastAsia="Calibri"/>
           <w:sz w:val="20"/>
         </w:rPr>
-        <w:t>NetLogo</w:t>
-      </w:r>
-      <w:proofErr w:type="spellEnd"/>
-      <w:r>
-        <w:rPr>
-          <w:rFonts w:eastAsia="Calibri"/>
-          <w:sz w:val="20"/>
-        </w:rPr>
-        <w:t xml:space="preserve"> El Farol model. Center for Connected Learning, Northwestern University. https://ccl.northwestern.edu/netlogo/models/ElFarol</w:t>
-      </w:r>
-    </w:p>
-    <w:p>
-      <w:pPr>
-        <w:spacing w:after="80"/>
-      </w:pPr>
-      <w:r>
-        <w:rPr>
-          <w:rFonts w:eastAsia="Calibri"/>
-          <w:sz w:val="20"/>
-        </w:rPr>
-        <w:t xml:space="preserve">Western Gazette. (2022). Using data to plan your trip to the rec </w:t>
-      </w:r>
-      <w:proofErr w:type="spellStart"/>
-      <w:r>
-        <w:rPr>
-          <w:rFonts w:eastAsia="Calibri"/>
-          <w:sz w:val="20"/>
-        </w:rPr>
-        <w:t>centre</w:t>
-      </w:r>
-      <w:proofErr w:type="spellEnd"/>
-      <w:r>
-        <w:rPr>
-          <w:rFonts w:eastAsia="Calibri"/>
-          <w:sz w:val="20"/>
-        </w:rPr>
-        <w:t>. https://westerngazette.ca/news/campus/using-data-to-plan-your-trip-to-the-rec-centre/article_a393ead8-70d7-11ed-8fbe-63379a003173.html</w:t>
+        <w:t>Western Gazette. (2022). Using data to plan your trip to the rec centre. https://westerngazette.ca/news/campus/using-data-to-plan-your-trip-to-the-rec-centre/article_a393ead8-70d7-11ed-8fbe-63379a003173.html</w:t>
       </w:r>
     </w:p>
     <w:sectPr>
@@ -2678,6 +2964,787 @@
       <w:rPr>
         <w:rFonts w:ascii="Symbol" w:hAnsi="Symbol" w:hint="default"/>
       </w:rPr>
+    </w:lvl>
+  </w:abstractNum>
+  <w:abstractNum w:abstractNumId="9" w15:restartNumberingAfterBreak="0">
+    <w:nsid w:val="0AFB71D8"/>
+    <w:multiLevelType w:val="hybridMultilevel"/>
+    <w:tmpl w:val="10248158"/>
+    <w:lvl w:ilvl="0" w:tplc="04090001">
+      <w:start w:val="1"/>
+      <w:numFmt w:val="bullet"/>
+      <w:lvlText w:val=""/>
+      <w:lvlJc w:val="left"/>
+      <w:pPr>
+        <w:ind w:left="720" w:hanging="360"/>
+      </w:pPr>
+      <w:rPr>
+        <w:rFonts w:ascii="Symbol" w:hAnsi="Symbol" w:hint="default"/>
+      </w:rPr>
+    </w:lvl>
+    <w:lvl w:ilvl="1" w:tplc="FFFFFFFF" w:tentative="1">
+      <w:start w:val="1"/>
+      <w:numFmt w:val="bullet"/>
+      <w:lvlText w:val="o"/>
+      <w:lvlJc w:val="left"/>
+      <w:pPr>
+        <w:ind w:left="1440" w:hanging="360"/>
+      </w:pPr>
+      <w:rPr>
+        <w:rFonts w:ascii="Courier New" w:hAnsi="Courier New" w:cs="Courier New" w:hint="default"/>
+      </w:rPr>
+    </w:lvl>
+    <w:lvl w:ilvl="2" w:tplc="FFFFFFFF" w:tentative="1">
+      <w:start w:val="1"/>
+      <w:numFmt w:val="bullet"/>
+      <w:lvlText w:val=""/>
+      <w:lvlJc w:val="left"/>
+      <w:pPr>
+        <w:ind w:left="2160" w:hanging="360"/>
+      </w:pPr>
+      <w:rPr>
+        <w:rFonts w:ascii="Wingdings" w:hAnsi="Wingdings" w:hint="default"/>
+      </w:rPr>
+    </w:lvl>
+    <w:lvl w:ilvl="3" w:tplc="FFFFFFFF" w:tentative="1">
+      <w:start w:val="1"/>
+      <w:numFmt w:val="bullet"/>
+      <w:lvlText w:val=""/>
+      <w:lvlJc w:val="left"/>
+      <w:pPr>
+        <w:ind w:left="2880" w:hanging="360"/>
+      </w:pPr>
+      <w:rPr>
+        <w:rFonts w:ascii="Symbol" w:hAnsi="Symbol" w:hint="default"/>
+      </w:rPr>
+    </w:lvl>
+    <w:lvl w:ilvl="4" w:tplc="FFFFFFFF" w:tentative="1">
+      <w:start w:val="1"/>
+      <w:numFmt w:val="bullet"/>
+      <w:lvlText w:val="o"/>
+      <w:lvlJc w:val="left"/>
+      <w:pPr>
+        <w:ind w:left="3600" w:hanging="360"/>
+      </w:pPr>
+      <w:rPr>
+        <w:rFonts w:ascii="Courier New" w:hAnsi="Courier New" w:cs="Courier New" w:hint="default"/>
+      </w:rPr>
+    </w:lvl>
+    <w:lvl w:ilvl="5" w:tplc="FFFFFFFF" w:tentative="1">
+      <w:start w:val="1"/>
+      <w:numFmt w:val="bullet"/>
+      <w:lvlText w:val=""/>
+      <w:lvlJc w:val="left"/>
+      <w:pPr>
+        <w:ind w:left="4320" w:hanging="360"/>
+      </w:pPr>
+      <w:rPr>
+        <w:rFonts w:ascii="Wingdings" w:hAnsi="Wingdings" w:hint="default"/>
+      </w:rPr>
+    </w:lvl>
+    <w:lvl w:ilvl="6" w:tplc="FFFFFFFF" w:tentative="1">
+      <w:start w:val="1"/>
+      <w:numFmt w:val="bullet"/>
+      <w:lvlText w:val=""/>
+      <w:lvlJc w:val="left"/>
+      <w:pPr>
+        <w:ind w:left="5040" w:hanging="360"/>
+      </w:pPr>
+      <w:rPr>
+        <w:rFonts w:ascii="Symbol" w:hAnsi="Symbol" w:hint="default"/>
+      </w:rPr>
+    </w:lvl>
+    <w:lvl w:ilvl="7" w:tplc="FFFFFFFF" w:tentative="1">
+      <w:start w:val="1"/>
+      <w:numFmt w:val="bullet"/>
+      <w:lvlText w:val="o"/>
+      <w:lvlJc w:val="left"/>
+      <w:pPr>
+        <w:ind w:left="5760" w:hanging="360"/>
+      </w:pPr>
+      <w:rPr>
+        <w:rFonts w:ascii="Courier New" w:hAnsi="Courier New" w:cs="Courier New" w:hint="default"/>
+      </w:rPr>
+    </w:lvl>
+    <w:lvl w:ilvl="8" w:tplc="FFFFFFFF" w:tentative="1">
+      <w:start w:val="1"/>
+      <w:numFmt w:val="bullet"/>
+      <w:lvlText w:val=""/>
+      <w:lvlJc w:val="left"/>
+      <w:pPr>
+        <w:ind w:left="6480" w:hanging="360"/>
+      </w:pPr>
+      <w:rPr>
+        <w:rFonts w:ascii="Wingdings" w:hAnsi="Wingdings" w:hint="default"/>
+      </w:rPr>
+    </w:lvl>
+  </w:abstractNum>
+  <w:abstractNum w:abstractNumId="10" w15:restartNumberingAfterBreak="0">
+    <w:nsid w:val="22E728E3"/>
+    <w:multiLevelType w:val="hybridMultilevel"/>
+    <w:tmpl w:val="9568374C"/>
+    <w:lvl w:ilvl="0" w:tplc="2AE84CA2">
+      <w:start w:val="1"/>
+      <w:numFmt w:val="decimal"/>
+      <w:lvlText w:val="%1."/>
+      <w:lvlJc w:val="left"/>
+      <w:pPr>
+        <w:ind w:left="720" w:hanging="360"/>
+      </w:pPr>
+      <w:rPr>
+        <w:rFonts w:eastAsia="Calibri" w:hint="default"/>
+      </w:rPr>
+    </w:lvl>
+    <w:lvl w:ilvl="1" w:tplc="04090019" w:tentative="1">
+      <w:start w:val="1"/>
+      <w:numFmt w:val="lowerLetter"/>
+      <w:lvlText w:val="%2."/>
+      <w:lvlJc w:val="left"/>
+      <w:pPr>
+        <w:ind w:left="1440" w:hanging="360"/>
+      </w:pPr>
+    </w:lvl>
+    <w:lvl w:ilvl="2" w:tplc="0409001B" w:tentative="1">
+      <w:start w:val="1"/>
+      <w:numFmt w:val="lowerRoman"/>
+      <w:lvlText w:val="%3."/>
+      <w:lvlJc w:val="right"/>
+      <w:pPr>
+        <w:ind w:left="2160" w:hanging="180"/>
+      </w:pPr>
+    </w:lvl>
+    <w:lvl w:ilvl="3" w:tplc="0409000F" w:tentative="1">
+      <w:start w:val="1"/>
+      <w:numFmt w:val="decimal"/>
+      <w:lvlText w:val="%4."/>
+      <w:lvlJc w:val="left"/>
+      <w:pPr>
+        <w:ind w:left="2880" w:hanging="360"/>
+      </w:pPr>
+    </w:lvl>
+    <w:lvl w:ilvl="4" w:tplc="04090019" w:tentative="1">
+      <w:start w:val="1"/>
+      <w:numFmt w:val="lowerLetter"/>
+      <w:lvlText w:val="%5."/>
+      <w:lvlJc w:val="left"/>
+      <w:pPr>
+        <w:ind w:left="3600" w:hanging="360"/>
+      </w:pPr>
+    </w:lvl>
+    <w:lvl w:ilvl="5" w:tplc="0409001B" w:tentative="1">
+      <w:start w:val="1"/>
+      <w:numFmt w:val="lowerRoman"/>
+      <w:lvlText w:val="%6."/>
+      <w:lvlJc w:val="right"/>
+      <w:pPr>
+        <w:ind w:left="4320" w:hanging="180"/>
+      </w:pPr>
+    </w:lvl>
+    <w:lvl w:ilvl="6" w:tplc="0409000F" w:tentative="1">
+      <w:start w:val="1"/>
+      <w:numFmt w:val="decimal"/>
+      <w:lvlText w:val="%7."/>
+      <w:lvlJc w:val="left"/>
+      <w:pPr>
+        <w:ind w:left="5040" w:hanging="360"/>
+      </w:pPr>
+    </w:lvl>
+    <w:lvl w:ilvl="7" w:tplc="04090019" w:tentative="1">
+      <w:start w:val="1"/>
+      <w:numFmt w:val="lowerLetter"/>
+      <w:lvlText w:val="%8."/>
+      <w:lvlJc w:val="left"/>
+      <w:pPr>
+        <w:ind w:left="5760" w:hanging="360"/>
+      </w:pPr>
+    </w:lvl>
+    <w:lvl w:ilvl="8" w:tplc="0409001B" w:tentative="1">
+      <w:start w:val="1"/>
+      <w:numFmt w:val="lowerRoman"/>
+      <w:lvlText w:val="%9."/>
+      <w:lvlJc w:val="right"/>
+      <w:pPr>
+        <w:ind w:left="6480" w:hanging="180"/>
+      </w:pPr>
+    </w:lvl>
+  </w:abstractNum>
+  <w:abstractNum w:abstractNumId="11" w15:restartNumberingAfterBreak="0">
+    <w:nsid w:val="54D06977"/>
+    <w:multiLevelType w:val="hybridMultilevel"/>
+    <w:tmpl w:val="7072356A"/>
+    <w:lvl w:ilvl="0" w:tplc="0409000F">
+      <w:start w:val="1"/>
+      <w:numFmt w:val="decimal"/>
+      <w:lvlText w:val="%1."/>
+      <w:lvlJc w:val="left"/>
+      <w:pPr>
+        <w:ind w:left="720" w:hanging="360"/>
+      </w:pPr>
+    </w:lvl>
+    <w:lvl w:ilvl="1" w:tplc="04090019" w:tentative="1">
+      <w:start w:val="1"/>
+      <w:numFmt w:val="lowerLetter"/>
+      <w:lvlText w:val="%2."/>
+      <w:lvlJc w:val="left"/>
+      <w:pPr>
+        <w:ind w:left="1440" w:hanging="360"/>
+      </w:pPr>
+    </w:lvl>
+    <w:lvl w:ilvl="2" w:tplc="0409001B" w:tentative="1">
+      <w:start w:val="1"/>
+      <w:numFmt w:val="lowerRoman"/>
+      <w:lvlText w:val="%3."/>
+      <w:lvlJc w:val="right"/>
+      <w:pPr>
+        <w:ind w:left="2160" w:hanging="180"/>
+      </w:pPr>
+    </w:lvl>
+    <w:lvl w:ilvl="3" w:tplc="0409000F" w:tentative="1">
+      <w:start w:val="1"/>
+      <w:numFmt w:val="decimal"/>
+      <w:lvlText w:val="%4."/>
+      <w:lvlJc w:val="left"/>
+      <w:pPr>
+        <w:ind w:left="2880" w:hanging="360"/>
+      </w:pPr>
+    </w:lvl>
+    <w:lvl w:ilvl="4" w:tplc="04090019" w:tentative="1">
+      <w:start w:val="1"/>
+      <w:numFmt w:val="lowerLetter"/>
+      <w:lvlText w:val="%5."/>
+      <w:lvlJc w:val="left"/>
+      <w:pPr>
+        <w:ind w:left="3600" w:hanging="360"/>
+      </w:pPr>
+    </w:lvl>
+    <w:lvl w:ilvl="5" w:tplc="0409001B" w:tentative="1">
+      <w:start w:val="1"/>
+      <w:numFmt w:val="lowerRoman"/>
+      <w:lvlText w:val="%6."/>
+      <w:lvlJc w:val="right"/>
+      <w:pPr>
+        <w:ind w:left="4320" w:hanging="180"/>
+      </w:pPr>
+    </w:lvl>
+    <w:lvl w:ilvl="6" w:tplc="0409000F" w:tentative="1">
+      <w:start w:val="1"/>
+      <w:numFmt w:val="decimal"/>
+      <w:lvlText w:val="%7."/>
+      <w:lvlJc w:val="left"/>
+      <w:pPr>
+        <w:ind w:left="5040" w:hanging="360"/>
+      </w:pPr>
+    </w:lvl>
+    <w:lvl w:ilvl="7" w:tplc="04090019" w:tentative="1">
+      <w:start w:val="1"/>
+      <w:numFmt w:val="lowerLetter"/>
+      <w:lvlText w:val="%8."/>
+      <w:lvlJc w:val="left"/>
+      <w:pPr>
+        <w:ind w:left="5760" w:hanging="360"/>
+      </w:pPr>
+    </w:lvl>
+    <w:lvl w:ilvl="8" w:tplc="0409001B" w:tentative="1">
+      <w:start w:val="1"/>
+      <w:numFmt w:val="lowerRoman"/>
+      <w:lvlText w:val="%9."/>
+      <w:lvlJc w:val="right"/>
+      <w:pPr>
+        <w:ind w:left="6480" w:hanging="180"/>
+      </w:pPr>
+    </w:lvl>
+  </w:abstractNum>
+  <w:abstractNum w:abstractNumId="12" w15:restartNumberingAfterBreak="0">
+    <w:nsid w:val="6547329A"/>
+    <w:multiLevelType w:val="hybridMultilevel"/>
+    <w:tmpl w:val="081A49CC"/>
+    <w:lvl w:ilvl="0" w:tplc="2AE84CA2">
+      <w:start w:val="1"/>
+      <w:numFmt w:val="decimal"/>
+      <w:lvlText w:val="%1."/>
+      <w:lvlJc w:val="left"/>
+      <w:pPr>
+        <w:ind w:left="720" w:hanging="360"/>
+      </w:pPr>
+      <w:rPr>
+        <w:rFonts w:eastAsia="Calibri" w:hint="default"/>
+      </w:rPr>
+    </w:lvl>
+    <w:lvl w:ilvl="1" w:tplc="04090019" w:tentative="1">
+      <w:start w:val="1"/>
+      <w:numFmt w:val="lowerLetter"/>
+      <w:lvlText w:val="%2."/>
+      <w:lvlJc w:val="left"/>
+      <w:pPr>
+        <w:ind w:left="1440" w:hanging="360"/>
+      </w:pPr>
+    </w:lvl>
+    <w:lvl w:ilvl="2" w:tplc="0409001B" w:tentative="1">
+      <w:start w:val="1"/>
+      <w:numFmt w:val="lowerRoman"/>
+      <w:lvlText w:val="%3."/>
+      <w:lvlJc w:val="right"/>
+      <w:pPr>
+        <w:ind w:left="2160" w:hanging="180"/>
+      </w:pPr>
+    </w:lvl>
+    <w:lvl w:ilvl="3" w:tplc="0409000F" w:tentative="1">
+      <w:start w:val="1"/>
+      <w:numFmt w:val="decimal"/>
+      <w:lvlText w:val="%4."/>
+      <w:lvlJc w:val="left"/>
+      <w:pPr>
+        <w:ind w:left="2880" w:hanging="360"/>
+      </w:pPr>
+    </w:lvl>
+    <w:lvl w:ilvl="4" w:tplc="04090019" w:tentative="1">
+      <w:start w:val="1"/>
+      <w:numFmt w:val="lowerLetter"/>
+      <w:lvlText w:val="%5."/>
+      <w:lvlJc w:val="left"/>
+      <w:pPr>
+        <w:ind w:left="3600" w:hanging="360"/>
+      </w:pPr>
+    </w:lvl>
+    <w:lvl w:ilvl="5" w:tplc="0409001B" w:tentative="1">
+      <w:start w:val="1"/>
+      <w:numFmt w:val="lowerRoman"/>
+      <w:lvlText w:val="%6."/>
+      <w:lvlJc w:val="right"/>
+      <w:pPr>
+        <w:ind w:left="4320" w:hanging="180"/>
+      </w:pPr>
+    </w:lvl>
+    <w:lvl w:ilvl="6" w:tplc="0409000F" w:tentative="1">
+      <w:start w:val="1"/>
+      <w:numFmt w:val="decimal"/>
+      <w:lvlText w:val="%7."/>
+      <w:lvlJc w:val="left"/>
+      <w:pPr>
+        <w:ind w:left="5040" w:hanging="360"/>
+      </w:pPr>
+    </w:lvl>
+    <w:lvl w:ilvl="7" w:tplc="04090019" w:tentative="1">
+      <w:start w:val="1"/>
+      <w:numFmt w:val="lowerLetter"/>
+      <w:lvlText w:val="%8."/>
+      <w:lvlJc w:val="left"/>
+      <w:pPr>
+        <w:ind w:left="5760" w:hanging="360"/>
+      </w:pPr>
+    </w:lvl>
+    <w:lvl w:ilvl="8" w:tplc="0409001B" w:tentative="1">
+      <w:start w:val="1"/>
+      <w:numFmt w:val="lowerRoman"/>
+      <w:lvlText w:val="%9."/>
+      <w:lvlJc w:val="right"/>
+      <w:pPr>
+        <w:ind w:left="6480" w:hanging="180"/>
+      </w:pPr>
+    </w:lvl>
+  </w:abstractNum>
+  <w:abstractNum w:abstractNumId="13" w15:restartNumberingAfterBreak="0">
+    <w:nsid w:val="6FB36E30"/>
+    <w:multiLevelType w:val="hybridMultilevel"/>
+    <w:tmpl w:val="5868F2E0"/>
+    <w:lvl w:ilvl="0" w:tplc="2AE84CA2">
+      <w:start w:val="1"/>
+      <w:numFmt w:val="decimal"/>
+      <w:lvlText w:val="%1."/>
+      <w:lvlJc w:val="left"/>
+      <w:pPr>
+        <w:ind w:left="720" w:hanging="360"/>
+      </w:pPr>
+      <w:rPr>
+        <w:rFonts w:eastAsia="Calibri" w:hint="default"/>
+      </w:rPr>
+    </w:lvl>
+    <w:lvl w:ilvl="1" w:tplc="04090019" w:tentative="1">
+      <w:start w:val="1"/>
+      <w:numFmt w:val="lowerLetter"/>
+      <w:lvlText w:val="%2."/>
+      <w:lvlJc w:val="left"/>
+      <w:pPr>
+        <w:ind w:left="1440" w:hanging="360"/>
+      </w:pPr>
+    </w:lvl>
+    <w:lvl w:ilvl="2" w:tplc="0409001B" w:tentative="1">
+      <w:start w:val="1"/>
+      <w:numFmt w:val="lowerRoman"/>
+      <w:lvlText w:val="%3."/>
+      <w:lvlJc w:val="right"/>
+      <w:pPr>
+        <w:ind w:left="2160" w:hanging="180"/>
+      </w:pPr>
+    </w:lvl>
+    <w:lvl w:ilvl="3" w:tplc="0409000F" w:tentative="1">
+      <w:start w:val="1"/>
+      <w:numFmt w:val="decimal"/>
+      <w:lvlText w:val="%4."/>
+      <w:lvlJc w:val="left"/>
+      <w:pPr>
+        <w:ind w:left="2880" w:hanging="360"/>
+      </w:pPr>
+    </w:lvl>
+    <w:lvl w:ilvl="4" w:tplc="04090019" w:tentative="1">
+      <w:start w:val="1"/>
+      <w:numFmt w:val="lowerLetter"/>
+      <w:lvlText w:val="%5."/>
+      <w:lvlJc w:val="left"/>
+      <w:pPr>
+        <w:ind w:left="3600" w:hanging="360"/>
+      </w:pPr>
+    </w:lvl>
+    <w:lvl w:ilvl="5" w:tplc="0409001B" w:tentative="1">
+      <w:start w:val="1"/>
+      <w:numFmt w:val="lowerRoman"/>
+      <w:lvlText w:val="%6."/>
+      <w:lvlJc w:val="right"/>
+      <w:pPr>
+        <w:ind w:left="4320" w:hanging="180"/>
+      </w:pPr>
+    </w:lvl>
+    <w:lvl w:ilvl="6" w:tplc="0409000F" w:tentative="1">
+      <w:start w:val="1"/>
+      <w:numFmt w:val="decimal"/>
+      <w:lvlText w:val="%7."/>
+      <w:lvlJc w:val="left"/>
+      <w:pPr>
+        <w:ind w:left="5040" w:hanging="360"/>
+      </w:pPr>
+    </w:lvl>
+    <w:lvl w:ilvl="7" w:tplc="04090019" w:tentative="1">
+      <w:start w:val="1"/>
+      <w:numFmt w:val="lowerLetter"/>
+      <w:lvlText w:val="%8."/>
+      <w:lvlJc w:val="left"/>
+      <w:pPr>
+        <w:ind w:left="5760" w:hanging="360"/>
+      </w:pPr>
+    </w:lvl>
+    <w:lvl w:ilvl="8" w:tplc="0409001B" w:tentative="1">
+      <w:start w:val="1"/>
+      <w:numFmt w:val="lowerRoman"/>
+      <w:lvlText w:val="%9."/>
+      <w:lvlJc w:val="right"/>
+      <w:pPr>
+        <w:ind w:left="6480" w:hanging="180"/>
+      </w:pPr>
+    </w:lvl>
+  </w:abstractNum>
+  <w:abstractNum w:abstractNumId="14" w15:restartNumberingAfterBreak="0">
+    <w:nsid w:val="7330436A"/>
+    <w:multiLevelType w:val="hybridMultilevel"/>
+    <w:tmpl w:val="F6E66BB6"/>
+    <w:lvl w:ilvl="0" w:tplc="04090001">
+      <w:start w:val="1"/>
+      <w:numFmt w:val="bullet"/>
+      <w:lvlText w:val=""/>
+      <w:lvlJc w:val="left"/>
+      <w:pPr>
+        <w:ind w:left="720" w:hanging="360"/>
+      </w:pPr>
+      <w:rPr>
+        <w:rFonts w:ascii="Symbol" w:hAnsi="Symbol" w:hint="default"/>
+      </w:rPr>
+    </w:lvl>
+    <w:lvl w:ilvl="1" w:tplc="04090003" w:tentative="1">
+      <w:start w:val="1"/>
+      <w:numFmt w:val="bullet"/>
+      <w:lvlText w:val="o"/>
+      <w:lvlJc w:val="left"/>
+      <w:pPr>
+        <w:ind w:left="1440" w:hanging="360"/>
+      </w:pPr>
+      <w:rPr>
+        <w:rFonts w:ascii="Courier New" w:hAnsi="Courier New" w:cs="Courier New" w:hint="default"/>
+      </w:rPr>
+    </w:lvl>
+    <w:lvl w:ilvl="2" w:tplc="04090005" w:tentative="1">
+      <w:start w:val="1"/>
+      <w:numFmt w:val="bullet"/>
+      <w:lvlText w:val=""/>
+      <w:lvlJc w:val="left"/>
+      <w:pPr>
+        <w:ind w:left="2160" w:hanging="360"/>
+      </w:pPr>
+      <w:rPr>
+        <w:rFonts w:ascii="Wingdings" w:hAnsi="Wingdings" w:hint="default"/>
+      </w:rPr>
+    </w:lvl>
+    <w:lvl w:ilvl="3" w:tplc="04090001" w:tentative="1">
+      <w:start w:val="1"/>
+      <w:numFmt w:val="bullet"/>
+      <w:lvlText w:val=""/>
+      <w:lvlJc w:val="left"/>
+      <w:pPr>
+        <w:ind w:left="2880" w:hanging="360"/>
+      </w:pPr>
+      <w:rPr>
+        <w:rFonts w:ascii="Symbol" w:hAnsi="Symbol" w:hint="default"/>
+      </w:rPr>
+    </w:lvl>
+    <w:lvl w:ilvl="4" w:tplc="04090003" w:tentative="1">
+      <w:start w:val="1"/>
+      <w:numFmt w:val="bullet"/>
+      <w:lvlText w:val="o"/>
+      <w:lvlJc w:val="left"/>
+      <w:pPr>
+        <w:ind w:left="3600" w:hanging="360"/>
+      </w:pPr>
+      <w:rPr>
+        <w:rFonts w:ascii="Courier New" w:hAnsi="Courier New" w:cs="Courier New" w:hint="default"/>
+      </w:rPr>
+    </w:lvl>
+    <w:lvl w:ilvl="5" w:tplc="04090005" w:tentative="1">
+      <w:start w:val="1"/>
+      <w:numFmt w:val="bullet"/>
+      <w:lvlText w:val=""/>
+      <w:lvlJc w:val="left"/>
+      <w:pPr>
+        <w:ind w:left="4320" w:hanging="360"/>
+      </w:pPr>
+      <w:rPr>
+        <w:rFonts w:ascii="Wingdings" w:hAnsi="Wingdings" w:hint="default"/>
+      </w:rPr>
+    </w:lvl>
+    <w:lvl w:ilvl="6" w:tplc="04090001" w:tentative="1">
+      <w:start w:val="1"/>
+      <w:numFmt w:val="bullet"/>
+      <w:lvlText w:val=""/>
+      <w:lvlJc w:val="left"/>
+      <w:pPr>
+        <w:ind w:left="5040" w:hanging="360"/>
+      </w:pPr>
+      <w:rPr>
+        <w:rFonts w:ascii="Symbol" w:hAnsi="Symbol" w:hint="default"/>
+      </w:rPr>
+    </w:lvl>
+    <w:lvl w:ilvl="7" w:tplc="04090003" w:tentative="1">
+      <w:start w:val="1"/>
+      <w:numFmt w:val="bullet"/>
+      <w:lvlText w:val="o"/>
+      <w:lvlJc w:val="left"/>
+      <w:pPr>
+        <w:ind w:left="5760" w:hanging="360"/>
+      </w:pPr>
+      <w:rPr>
+        <w:rFonts w:ascii="Courier New" w:hAnsi="Courier New" w:cs="Courier New" w:hint="default"/>
+      </w:rPr>
+    </w:lvl>
+    <w:lvl w:ilvl="8" w:tplc="04090005" w:tentative="1">
+      <w:start w:val="1"/>
+      <w:numFmt w:val="bullet"/>
+      <w:lvlText w:val=""/>
+      <w:lvlJc w:val="left"/>
+      <w:pPr>
+        <w:ind w:left="6480" w:hanging="360"/>
+      </w:pPr>
+      <w:rPr>
+        <w:rFonts w:ascii="Wingdings" w:hAnsi="Wingdings" w:hint="default"/>
+      </w:rPr>
+    </w:lvl>
+  </w:abstractNum>
+  <w:abstractNum w:abstractNumId="15" w15:restartNumberingAfterBreak="0">
+    <w:nsid w:val="7419462A"/>
+    <w:multiLevelType w:val="hybridMultilevel"/>
+    <w:tmpl w:val="1556C8CE"/>
+    <w:lvl w:ilvl="0" w:tplc="04090001">
+      <w:start w:val="1"/>
+      <w:numFmt w:val="bullet"/>
+      <w:lvlText w:val=""/>
+      <w:lvlJc w:val="left"/>
+      <w:pPr>
+        <w:ind w:left="720" w:hanging="360"/>
+      </w:pPr>
+      <w:rPr>
+        <w:rFonts w:ascii="Symbol" w:hAnsi="Symbol" w:hint="default"/>
+      </w:rPr>
+    </w:lvl>
+    <w:lvl w:ilvl="1" w:tplc="04090003" w:tentative="1">
+      <w:start w:val="1"/>
+      <w:numFmt w:val="bullet"/>
+      <w:lvlText w:val="o"/>
+      <w:lvlJc w:val="left"/>
+      <w:pPr>
+        <w:ind w:left="1440" w:hanging="360"/>
+      </w:pPr>
+      <w:rPr>
+        <w:rFonts w:ascii="Courier New" w:hAnsi="Courier New" w:cs="Courier New" w:hint="default"/>
+      </w:rPr>
+    </w:lvl>
+    <w:lvl w:ilvl="2" w:tplc="04090005" w:tentative="1">
+      <w:start w:val="1"/>
+      <w:numFmt w:val="bullet"/>
+      <w:lvlText w:val=""/>
+      <w:lvlJc w:val="left"/>
+      <w:pPr>
+        <w:ind w:left="2160" w:hanging="360"/>
+      </w:pPr>
+      <w:rPr>
+        <w:rFonts w:ascii="Wingdings" w:hAnsi="Wingdings" w:hint="default"/>
+      </w:rPr>
+    </w:lvl>
+    <w:lvl w:ilvl="3" w:tplc="04090001" w:tentative="1">
+      <w:start w:val="1"/>
+      <w:numFmt w:val="bullet"/>
+      <w:lvlText w:val=""/>
+      <w:lvlJc w:val="left"/>
+      <w:pPr>
+        <w:ind w:left="2880" w:hanging="360"/>
+      </w:pPr>
+      <w:rPr>
+        <w:rFonts w:ascii="Symbol" w:hAnsi="Symbol" w:hint="default"/>
+      </w:rPr>
+    </w:lvl>
+    <w:lvl w:ilvl="4" w:tplc="04090003" w:tentative="1">
+      <w:start w:val="1"/>
+      <w:numFmt w:val="bullet"/>
+      <w:lvlText w:val="o"/>
+      <w:lvlJc w:val="left"/>
+      <w:pPr>
+        <w:ind w:left="3600" w:hanging="360"/>
+      </w:pPr>
+      <w:rPr>
+        <w:rFonts w:ascii="Courier New" w:hAnsi="Courier New" w:cs="Courier New" w:hint="default"/>
+      </w:rPr>
+    </w:lvl>
+    <w:lvl w:ilvl="5" w:tplc="04090005" w:tentative="1">
+      <w:start w:val="1"/>
+      <w:numFmt w:val="bullet"/>
+      <w:lvlText w:val=""/>
+      <w:lvlJc w:val="left"/>
+      <w:pPr>
+        <w:ind w:left="4320" w:hanging="360"/>
+      </w:pPr>
+      <w:rPr>
+        <w:rFonts w:ascii="Wingdings" w:hAnsi="Wingdings" w:hint="default"/>
+      </w:rPr>
+    </w:lvl>
+    <w:lvl w:ilvl="6" w:tplc="04090001" w:tentative="1">
+      <w:start w:val="1"/>
+      <w:numFmt w:val="bullet"/>
+      <w:lvlText w:val=""/>
+      <w:lvlJc w:val="left"/>
+      <w:pPr>
+        <w:ind w:left="5040" w:hanging="360"/>
+      </w:pPr>
+      <w:rPr>
+        <w:rFonts w:ascii="Symbol" w:hAnsi="Symbol" w:hint="default"/>
+      </w:rPr>
+    </w:lvl>
+    <w:lvl w:ilvl="7" w:tplc="04090003" w:tentative="1">
+      <w:start w:val="1"/>
+      <w:numFmt w:val="bullet"/>
+      <w:lvlText w:val="o"/>
+      <w:lvlJc w:val="left"/>
+      <w:pPr>
+        <w:ind w:left="5760" w:hanging="360"/>
+      </w:pPr>
+      <w:rPr>
+        <w:rFonts w:ascii="Courier New" w:hAnsi="Courier New" w:cs="Courier New" w:hint="default"/>
+      </w:rPr>
+    </w:lvl>
+    <w:lvl w:ilvl="8" w:tplc="04090005" w:tentative="1">
+      <w:start w:val="1"/>
+      <w:numFmt w:val="bullet"/>
+      <w:lvlText w:val=""/>
+      <w:lvlJc w:val="left"/>
+      <w:pPr>
+        <w:ind w:left="6480" w:hanging="360"/>
+      </w:pPr>
+      <w:rPr>
+        <w:rFonts w:ascii="Wingdings" w:hAnsi="Wingdings" w:hint="default"/>
+      </w:rPr>
+    </w:lvl>
+  </w:abstractNum>
+  <w:abstractNum w:abstractNumId="16" w15:restartNumberingAfterBreak="0">
+    <w:nsid w:val="7FB10A0F"/>
+    <w:multiLevelType w:val="hybridMultilevel"/>
+    <w:tmpl w:val="3BA47CBE"/>
+    <w:lvl w:ilvl="0" w:tplc="2AE84CA2">
+      <w:start w:val="1"/>
+      <w:numFmt w:val="decimal"/>
+      <w:lvlText w:val="%1."/>
+      <w:lvlJc w:val="left"/>
+      <w:pPr>
+        <w:ind w:left="720" w:hanging="360"/>
+      </w:pPr>
+      <w:rPr>
+        <w:rFonts w:eastAsia="Calibri" w:hint="default"/>
+      </w:rPr>
+    </w:lvl>
+    <w:lvl w:ilvl="1" w:tplc="04090019" w:tentative="1">
+      <w:start w:val="1"/>
+      <w:numFmt w:val="lowerLetter"/>
+      <w:lvlText w:val="%2."/>
+      <w:lvlJc w:val="left"/>
+      <w:pPr>
+        <w:ind w:left="1440" w:hanging="360"/>
+      </w:pPr>
+    </w:lvl>
+    <w:lvl w:ilvl="2" w:tplc="0409001B" w:tentative="1">
+      <w:start w:val="1"/>
+      <w:numFmt w:val="lowerRoman"/>
+      <w:lvlText w:val="%3."/>
+      <w:lvlJc w:val="right"/>
+      <w:pPr>
+        <w:ind w:left="2160" w:hanging="180"/>
+      </w:pPr>
+    </w:lvl>
+    <w:lvl w:ilvl="3" w:tplc="0409000F" w:tentative="1">
+      <w:start w:val="1"/>
+      <w:numFmt w:val="decimal"/>
+      <w:lvlText w:val="%4."/>
+      <w:lvlJc w:val="left"/>
+      <w:pPr>
+        <w:ind w:left="2880" w:hanging="360"/>
+      </w:pPr>
+    </w:lvl>
+    <w:lvl w:ilvl="4" w:tplc="04090019" w:tentative="1">
+      <w:start w:val="1"/>
+      <w:numFmt w:val="lowerLetter"/>
+      <w:lvlText w:val="%5."/>
+      <w:lvlJc w:val="left"/>
+      <w:pPr>
+        <w:ind w:left="3600" w:hanging="360"/>
+      </w:pPr>
+    </w:lvl>
+    <w:lvl w:ilvl="5" w:tplc="0409001B" w:tentative="1">
+      <w:start w:val="1"/>
+      <w:numFmt w:val="lowerRoman"/>
+      <w:lvlText w:val="%6."/>
+      <w:lvlJc w:val="right"/>
+      <w:pPr>
+        <w:ind w:left="4320" w:hanging="180"/>
+      </w:pPr>
+    </w:lvl>
+    <w:lvl w:ilvl="6" w:tplc="0409000F" w:tentative="1">
+      <w:start w:val="1"/>
+      <w:numFmt w:val="decimal"/>
+      <w:lvlText w:val="%7."/>
+      <w:lvlJc w:val="left"/>
+      <w:pPr>
+        <w:ind w:left="5040" w:hanging="360"/>
+      </w:pPr>
+    </w:lvl>
+    <w:lvl w:ilvl="7" w:tplc="04090019" w:tentative="1">
+      <w:start w:val="1"/>
+      <w:numFmt w:val="lowerLetter"/>
+      <w:lvlText w:val="%8."/>
+      <w:lvlJc w:val="left"/>
+      <w:pPr>
+        <w:ind w:left="5760" w:hanging="360"/>
+      </w:pPr>
+    </w:lvl>
+    <w:lvl w:ilvl="8" w:tplc="0409001B" w:tentative="1">
+      <w:start w:val="1"/>
+      <w:numFmt w:val="lowerRoman"/>
+      <w:lvlText w:val="%9."/>
+      <w:lvlJc w:val="right"/>
+      <w:pPr>
+        <w:ind w:left="6480" w:hanging="180"/>
+      </w:pPr>
     </w:lvl>
   </w:abstractNum>
   <w:num w:numId="1" w16cid:durableId="1290089611">
@@ -2706,6 +3773,30 @@
   </w:num>
   <w:num w:numId="9" w16cid:durableId="648440798">
     <w:abstractNumId w:val="0"/>
+  </w:num>
+  <w:num w:numId="10" w16cid:durableId="1105345945">
+    <w:abstractNumId w:val="11"/>
+  </w:num>
+  <w:num w:numId="11" w16cid:durableId="1551654197">
+    <w:abstractNumId w:val="16"/>
+  </w:num>
+  <w:num w:numId="12" w16cid:durableId="1664119446">
+    <w:abstractNumId w:val="10"/>
+  </w:num>
+  <w:num w:numId="13" w16cid:durableId="8455592">
+    <w:abstractNumId w:val="13"/>
+  </w:num>
+  <w:num w:numId="14" w16cid:durableId="1543253681">
+    <w:abstractNumId w:val="14"/>
+  </w:num>
+  <w:num w:numId="15" w16cid:durableId="991178251">
+    <w:abstractNumId w:val="9"/>
+  </w:num>
+  <w:num w:numId="16" w16cid:durableId="1512259263">
+    <w:abstractNumId w:val="12"/>
+  </w:num>
+  <w:num w:numId="17" w16cid:durableId="1350256343">
+    <w:abstractNumId w:val="15"/>
   </w:num>
 </w:numbering>
 </file>

</xml_diff>